<commit_message>
fix: corrigir estruturacao XML do contrato docx, salvar payload do contrato no banco de dados e adicionar botao de download de contrato por 3 meses na tabela de estoque
</commit_message>
<xml_diff>
--- a/frontend/public/modelo_contrato_dricar.docx
+++ b/frontend/public/modelo_contrato_dricar.docx
@@ -1,6 +1,1939 @@
 
-<file path=word/document.xml><?xml version="1.0" encoding="UTF-8" standalone="yes"?>
-<w:document xmlns:wpc="http://schemas.microsoft.com/office/word/2010/wordprocessingCanvas" xmlns:cx="http://schemas.microsoft.com/office/drawing/2014/chartex" xmlns:cx1="http://schemas.microsoft.com/office/drawing/2015/9/8/chartex" xmlns:cx2="http://schemas.microsoft.com/office/drawing/2015/10/21/chartex" xmlns:cx3="http://schemas.microsoft.com/office/drawing/2016/5/9/chartex" xmlns:cx4="http://schemas.microsoft.com/office/drawing/2016/5/10/chartex" xmlns:cx5="http://schemas.microsoft.com/office/drawing/2016/5/11/chartex" xmlns:cx6="http://schemas.microsoft.com/office/drawing/2016/5/12/chartex" xmlns:cx7="http://schemas.microsoft.com/office/drawing/2016/5/13/chartex" xmlns:cx8="http://schemas.microsoft.com/office/drawing/2016/5/14/chartex" xmlns:mc="http://schemas.openxmlformats.org/markup-compatibility/2006" xmlns:aink="http://schemas.microsoft.com/office/drawing/2016/ink" xmlns:am3d="http://schemas.microsoft.com/office/drawing/2017/model3d" xmlns:o="urn:schemas-microsoft-com:office:office" xmlns:oel="http://schemas.microsoft.com/office/2019/extlst" xmlns:r="http://schemas.openxmlformats.org/officeDocument/2006/relationships" xmlns:m="http://schemas.openxmlformats.org/officeDocument/2006/math" xmlns:v="urn:schemas-microsoft-com:vml" xmlns:wp14="http://schemas.microsoft.com/office/word/2010/wordprocessingDrawing" xmlns:wp="http://schemas.openxmlformats.org/drawingml/2006/wordprocessingDrawing" xmlns:w10="urn:schemas-microsoft-com:office:word" xmlns:w="http://schemas.openxmlformats.org/wordprocessingml/2006/main" xmlns:w14="http://schemas.microsoft.com/office/word/2010/wordml" xmlns:w15="http://schemas.microsoft.com/office/word/2012/wordml" xmlns:w16cex="http://schemas.microsoft.com/office/word/2018/wordml/cex" xmlns:w16cid="http://schemas.microsoft.com/office/word/2016/wordml/cid" xmlns:w16="http://schemas.microsoft.com/office/word/2018/wordml" xmlns:w16du="http://schemas.microsoft.com/office/word/2023/wordml/word16du" xmlns:w16sdtdh="http://schemas.microsoft.com/office/word/2020/wordml/sdtdatahash" xmlns:w16sdtfl="http://schemas.microsoft.com/office/word/2024/wordml/sdtformatlock" xmlns:w16se="http://schemas.microsoft.com/office/word/2015/wordml/symex" xmlns:wpg="http://schemas.microsoft.com/office/word/2010/wordprocessingGroup" xmlns:wpi="http://schemas.microsoft.com/office/word/2010/wordprocessingInk" xmlns:wne="http://schemas.microsoft.com/office/word/2006/wordml" xmlns:wps="http://schemas.microsoft.com/office/word/2010/wordprocessingShape" mc:Ignorable="w14 w15 w16se w16cid w16 w16cex w16sdtdh w16sdtfl w16du wp14"><w:body><w:tbl><w:tblPr><w:tblW w:w="10772" w:type="dxa"/><w:tblLayout w:type="fixed"/><w:tblLook w:val="04A0" w:firstRow="1" w:lastRow="0" w:firstColumn="1" w:lastColumn="0" w:noHBand="0" w:noVBand="1"/></w:tblPr><w:tblGrid><w:gridCol w:w="4200"/><w:gridCol w:w="6572"/></w:tblGrid><w:tr><w:tc><w:tcPr><w:tcW w:w="4200" w:type="dxa"/><w:vAlign w:val="center"/></w:tcPr><w:p><w:r><w:rPr><w:noProof/></w:rPr><w:drawing><wp:inline distT="0" distB="0" distL="0" distR="0" wp14:anchorId="7FDF00C7" wp14:editId="292DBDD1"><wp:extent cx="1447800" cy="542925"/><wp:effectExtent l="0" t="0" r="0" b="0"/><wp:docPr id="1" name="Image1"/><wp:cNvGraphicFramePr><a:graphicFrameLocks xmlns:a="http://schemas.openxmlformats.org/drawingml/2006/main" noChangeAspect="1"/></wp:cNvGraphicFramePr><a:graphic xmlns:a="http://schemas.openxmlformats.org/drawingml/2006/main"><a:graphicData uri="http://schemas.openxmlformats.org/drawingml/2006/picture"><pic:pic xmlns:pic="http://schemas.openxmlformats.org/drawingml/2006/picture"><pic:nvPicPr><pic:cNvPr id="1" name="Image1"/><pic:cNvPicPr><a:picLocks noChangeAspect="1" noChangeArrowheads="1"/></pic:cNvPicPr></pic:nvPicPr><pic:blipFill><a:blip r:embed="rId4"/><a:stretch><a:fillRect/></a:stretch></pic:blipFill><pic:spPr bwMode="auto"><a:xfrm><a:off x="0" y="0"/><a:ext cx="1447800" cy="542925"/></a:xfrm><a:prstGeom prst="rect"><a:avLst/></a:prstGeom></pic:spPr></pic:pic></a:graphicData></a:graphic></wp:inline></w:drawing></w:r></w:p></w:tc><w:tc><w:tcPr><w:tcW w:w="6571" w:type="dxa"/><w:vAlign w:val="bottom"/></w:tcPr><w:p><w:pPr><w:spacing w:line="200" w:lineRule="exact"/><w:jc w:val="right"/><w:rPr><w:lang w:val="pt-BR"/></w:rPr></w:pPr><w:r><w:rPr><w:color w:val="6E6E6E"/><w:spacing w:val="44"/><w:sz w:val="13"/><w:szCs w:val="13"/><w:lang w:val="pt-BR"/></w:rPr><w:t>CONTRATO PARTICULAR DE</w:t></w:r></w:p><w:p><w:pPr><w:spacing w:line="240" w:lineRule="exact"/><w:jc w:val="right"/><w:rPr><w:lang w:val="pt-BR"/></w:rPr></w:pPr><w:r><w:rPr><w:b/><w:bCs/><w:color w:val="000000"/><w:spacing w:val="4"/><w:sz w:val="26"/><w:szCs w:val="26"/><w:lang w:val="pt-BR"/></w:rPr><w:t>COMPRA E VENDA DE VEÍCULO</w:t></w:r></w:p></w:tc></w:tr></w:tbl><w:p><w:pPr><w:pBdr><w:bottom w:val="single" w:sz="14" w:space="0" w:color="000000"/></w:pBdr><w:spacing w:before="30" w:after="90"/><w:rPr><w:lang w:val="pt-BR"/></w:rPr></w:pPr></w:p><w:tbl><w:tblPr><w:tblW w:w="10772" w:type="dxa"/><w:tblLayout w:type="fixed"/><w:tblCellMar><w:top w:w="50" w:type="dxa"/><w:left w:w="110" w:type="dxa"/><w:bottom w:w="50" w:type="dxa"/><w:right w:w="110" w:type="dxa"/></w:tblCellMar><w:tblLook w:val="04A0" w:firstRow="1" w:lastRow="0" w:firstColumn="1" w:lastColumn="0" w:noHBand="0" w:noVBand="1"/></w:tblPr><w:tblGrid><w:gridCol w:w="5386"/><w:gridCol w:w="2693"/><w:gridCol w:w="2693"/></w:tblGrid><w:tr><w:tc><w:tcPr><w:tcW w:w="10772" w:type="dxa"/><w:gridSpan w:val="3"/><w:shd w:val="clear" w:color="auto" w:fill="000000"/></w:tcPr><w:p><w:r><w:rPr><w:b/><w:bCs/><w:color w:val="FFFFFF"/><w:spacing w:val="26"/></w:rPr><w:t>1. DADOS DO VENDEDOR</w:t></w:r></w:p></w:tc></w:tr><w:tr><w:tc><w:tcPr><w:tcW w:w="5386" w:type="dxa"/><w:tcBorders><w:bottom w:val="single" w:sz="2" w:space="0" w:color="CFCFCF"/></w:tcBorders><w:tcMar><w:top w:w="60" w:type="dxa"/><w:bottom w:w="60" w:type="dxa"/></w:tcMar><w:vAlign w:val="center"/></w:tcPr><w:p><w:pPr><w:spacing w:line="190" w:lineRule="exact"/><w:rPr><w:lang w:val="pt-BR"/></w:rPr></w:pPr><w:r><w:rPr><w:color w:val="6E6E6E"/><w:spacing w:val="14"/><w:sz w:val="12"/><w:szCs w:val="12"/><w:lang w:val="pt-BR"/></w:rPr><w:t>RAZÃO SOCIAL</w:t></w:r></w:p><w:p><w:pPr><w:spacing w:line="200" w:lineRule="exact"/><w:rPr><w:lang w:val="pt-BR"/></w:rPr></w:pPr><w:r><w:rPr><w:b/><w:bCs/><w:color w:val="000000"/><w:sz w:val="16"/><w:szCs w:val="16"/><w:lang w:val="pt-BR"/></w:rPr><w:t>R C P VEÍCULOS EIRELI</w:t></w:r></w:p></w:tc><w:tc><w:tcPr><w:tcW w:w="2693" w:type="dxa"/><w:tcBorders><w:bottom w:val="single" w:sz="2" w:space="0" w:color="CFCFCF"/></w:tcBorders><w:tcMar><w:top w:w="60" w:type="dxa"/><w:bottom w:w="60" w:type="dxa"/></w:tcMar><w:vAlign w:val="center"/></w:tcPr><w:p><w:pPr><w:spacing w:line="190" w:lineRule="exact"/></w:pPr><w:r><w:rPr><w:color w:val="6E6E6E"/><w:spacing w:val="14"/><w:sz w:val="12"/><w:szCs w:val="12"/></w:rPr><w:t>CNPJ</w:t></w:r></w:p><w:p><w:pPr><w:spacing w:line="200" w:lineRule="exact"/></w:pPr><w:r><w:rPr><w:b/><w:bCs/><w:color w:val="000000"/><w:sz w:val="16"/><w:szCs w:val="16"/></w:rPr><w:t>24.636.780/0001-2</w:t></w:r><w:r><w:rPr><w:b/><w:bCs/><w:color w:val="000000"/><w:sz w:val="16"/><w:szCs w:val="16"/></w:rPr><w:t>9</w:t></w:r></w:p></w:tc><w:tc><w:tcPr><w:tcW w:w="2693" w:type="dxa"/><w:tcBorders><w:bottom w:val="single" w:sz="2" w:space="0" w:color="CFCFCF"/></w:tcBorders><w:tcMar><w:top w:w="60" w:type="dxa"/><w:bottom w:w="60" w:type="dxa"/></w:tcMar><w:vAlign w:val="center"/></w:tcPr><w:p><w:pPr><w:spacing w:line="190" w:lineRule="exact"/></w:pPr><w:r><w:rPr><w:color w:val="6E6E6E"/><w:spacing w:val="14"/><w:sz w:val="12"/><w:szCs w:val="12"/></w:rPr><w:t>TELEFONE</w:t></w:r></w:p><w:p><w:pPr><w:spacing w:line="200" w:lineRule="exact"/></w:pPr><w:r><w:rPr><w:b/><w:bCs/><w:color w:val="000000"/><w:sz w:val="16"/><w:szCs w:val="16"/></w:rPr><w:t>(27) 99636-1212</w:t></w:r></w:p></w:tc></w:tr><w:tr><w:tc><w:tcPr><w:tcW w:w="5386" w:type="dxa"/><w:tcBorders><w:bottom w:val="single" w:sz="2" w:space="0" w:color="CFCFCF"/></w:tcBorders><w:tcMar><w:top w:w="60" w:type="dxa"/><w:bottom w:w="60" w:type="dxa"/></w:tcMar><w:vAlign w:val="center"/></w:tcPr><w:p><w:pPr><w:spacing w:line="190" w:lineRule="exact"/><w:rPr><w:lang w:val="pt-BR"/></w:rPr></w:pPr><w:r><w:rPr><w:color w:val="6E6E6E"/><w:spacing w:val="14"/><w:sz w:val="12"/><w:szCs w:val="12"/><w:lang w:val="pt-BR"/></w:rPr><w:t>ENDEREÇO</w:t></w:r></w:p><w:p><w:pPr><w:spacing w:line="200" w:lineRule="exact"/><w:rPr><w:lang w:val="pt-BR"/></w:rPr></w:pPr><w:r><w:rPr><w:b/><w:bCs/><w:color w:val="000000"/><w:sz w:val="16"/><w:szCs w:val="16"/><w:lang w:val="pt-BR"/></w:rPr><w:t>Rua Santo Antônio, 248 — Muquiçaba</w:t></w:r></w:p></w:tc><w:tc><w:tcPr><w:tcW w:w="2693" w:type="dxa"/><w:tcBorders><w:bottom w:val="single" w:sz="2" w:space="0" w:color="CFCFCF"/></w:tcBorders><w:tcMar><w:top w:w="60" w:type="dxa"/><w:bottom w:w="60" w:type="dxa"/></w:tcMar><w:vAlign w:val="center"/></w:tcPr><w:p><w:pPr><w:spacing w:line="190" w:lineRule="exact"/></w:pPr><w:r><w:rPr><w:color w:val="6E6E6E"/><w:spacing w:val="14"/><w:sz w:val="12"/><w:szCs w:val="12"/></w:rPr><w:t>CIDADE / UF</w:t></w:r></w:p><w:p><w:pPr><w:spacing w:line="200" w:lineRule="exact"/></w:pPr><w:r><w:rPr><w:b/><w:bCs/><w:color w:val="000000"/><w:sz w:val="16"/><w:szCs w:val="16"/></w:rPr><w:t>Guarapari / ES</w:t></w:r></w:p></w:tc><w:tc><w:tcPr><w:tcW w:w="2693" w:type="dxa"/><w:tcBorders><w:bottom w:val="single" w:sz="2" w:space="0" w:color="CFCFCF"/></w:tcBorders><w:tcMar><w:top w:w="60" w:type="dxa"/><w:bottom w:w="60" w:type="dxa"/></w:tcMar><w:vAlign w:val="center"/></w:tcPr><w:p><w:pPr><w:spacing w:line="190" w:lineRule="exact"/></w:pPr><w:r><w:rPr><w:color w:val="6E6E6E"/><w:spacing w:val="14"/><w:sz w:val="12"/><w:szCs w:val="12"/></w:rPr><w:t>CEP</w:t></w:r></w:p><w:p><w:pPr><w:spacing w:line="200" w:lineRule="exact"/></w:pPr><w:r><w:rPr><w:b/><w:bCs/><w:color w:val="000000"/><w:sz w:val="16"/><w:szCs w:val="16"/></w:rPr><w:t>29.215-030</w:t></w:r></w:p></w:tc></w:tr></w:tbl><w:p><w:pPr><w:spacing w:after="60"/></w:pPr></w:p><w:tbl><w:tblPr><w:tblW w:w="10772" w:type="dxa"/><w:tblLayout w:type="fixed"/><w:tblCellMar><w:top w:w="50" w:type="dxa"/><w:left w:w="110" w:type="dxa"/><w:bottom w:w="50" w:type="dxa"/><w:right w:w="110" w:type="dxa"/></w:tblCellMar><w:tblLook w:val="04A0" w:firstRow="1" w:lastRow="0" w:firstColumn="1" w:lastColumn="0" w:noHBand="0" w:noVBand="1"/></w:tblPr><w:tblGrid><w:gridCol w:w="2694"/><w:gridCol w:w="2693"/><w:gridCol w:w="2693"/><w:gridCol w:w="2692"/></w:tblGrid><w:tr><w:tc><w:tcPr><w:tcW w:w="10771" w:type="dxa"/><w:gridSpan w:val="4"/><w:shd w:val="clear" w:color="auto" w:fill="000000"/></w:tcPr><w:p><w:r><w:rPr><w:b/><w:bCs/><w:color w:val="FFFFFF"/><w:spacing w:val="26"/></w:rPr><w:t>2. DADOS DO COMPRADOR</w:t></w:r></w:p></w:tc></w:tr><w:tr><w:tc><w:tcPr><w:tcW w:w="5386" w:type="dxa"/><w:gridSpan w:val="2"/><w:tcBorders><w:bottom w:val="single" w:sz="2" w:space="0" w:color="CFCFCF"/></w:tcBorders><w:tcMar><w:top w:w="60" w:type="dxa"/><w:bottom w:w="60" w:type="dxa"/></w:tcMar><w:vAlign w:val="center"/></w:tcPr><w:p><w:pPr><w:spacing w:line="190" w:lineRule="exact"/><w:rPr><w:lang w:val="pt-BR"/></w:rPr></w:pPr><w:r><w:rPr><w:color w:val="6E6E6E"/><w:spacing w:val="14"/><w:sz w:val="12"/><w:szCs w:val="12"/><w:lang w:val="pt-BR"/></w:rPr><w:t>NOME COMPLETO</w:t></w:r></w:p><w:p><w:pPr><w:spacing w:line="200" w:lineRule="exact"/><w:rPr><w:lang w:val="pt-BR"/></w:rPr></w:pPr><w:r><w:rPr><w:b/><w:bCs/><w:color w:val="000000"/><w:sz w:val="16"/><w:szCs w:val="16"/><w:lang w:val="pt-BR"/></w:rPr><w:t>{NOME_COMPRADOR}</w:t></w:r></w:p></w:tc><w:tc><w:tcPr><w:tcW w:w="2693" w:type="dxa"/><w:tcBorders><w:bottom w:val="single" w:sz="2" w:space="0" w:color="CFCFCF"/></w:tcBorders><w:tcMar><w:top w:w="60" w:type="dxa"/><w:bottom w:w="60" w:type="dxa"/></w:tcMar><w:vAlign w:val="center"/></w:tcPr><w:p><w:pPr><w:spacing w:line="190" w:lineRule="exact"/></w:pPr><w:r><w:rPr><w:color w:val="6E6E6E"/><w:spacing w:val="14"/><w:sz w:val="12"/><w:szCs w:val="12"/></w:rPr><w:t>CPF</w:t></w:r></w:p><w:p><w:pPr><w:spacing w:line="200" w:lineRule="exact"/></w:pPr><w:r><w:rPr><w:b/><w:bCs/><w:color w:val="000000"/><w:sz w:val="16"/><w:szCs w:val="16"/></w:rPr><w:t>{CPF_COMPRADOR}</w:t></w:r></w:p></w:tc><w:tc><w:tcPr><w:tcW w:w="2692" w:type="dxa"/><w:tcBorders><w:bottom w:val="single" w:sz="2" w:space="0" w:color="CFCFCF"/></w:tcBorders><w:tcMar><w:top w:w="60" w:type="dxa"/><w:bottom w:w="60" w:type="dxa"/></w:tcMar><w:vAlign w:val="center"/></w:tcPr><w:p><w:pPr><w:spacing w:line="190" w:lineRule="exact"/></w:pPr><w:r><w:rPr><w:color w:val="6E6E6E"/><w:spacing w:val="14"/><w:sz w:val="12"/><w:szCs w:val="12"/></w:rPr><w:t>RG / INSCRIÇÃO</w:t></w:r></w:p><w:p><w:pPr><w:spacing w:line="200" w:lineRule="exact"/></w:pPr><w:r><w:rPr><w:b/><w:bCs/><w:color w:val="000000"/><w:sz w:val="16"/><w:szCs w:val="16"/></w:rPr><w:t>{RG_COMPRADOR}</w:t></w:r></w:p></w:tc></w:tr><w:tr><w:tc><w:tcPr><w:tcW w:w="2693" w:type="dxa"/><w:tcBorders><w:bottom w:val="single" w:sz="2" w:space="0" w:color="CFCFCF"/></w:tcBorders><w:tcMar><w:top w:w="60" w:type="dxa"/><w:bottom w:w="60" w:type="dxa"/></w:tcMar><w:vAlign w:val="center"/></w:tcPr><w:p><w:pPr><w:spacing w:line="190" w:lineRule="exact"/></w:pPr><w:r><w:rPr><w:color w:val="6E6E6E"/><w:spacing w:val="14"/><w:sz w:val="12"/><w:szCs w:val="12"/></w:rPr><w:t>ESTADO CIVIL</w:t></w:r></w:p><w:p><w:pPr><w:spacing w:line="200" w:lineRule="exact"/></w:pPr><w:r><w:rPr><w:b/><w:bCs/><w:color w:val="000000"/><w:sz w:val="16"/><w:szCs w:val="16"/></w:rPr><w:t>{ESTADO_CIVIL}</w:t></w:r></w:p></w:tc><w:tc><w:tcPr><w:tcW w:w="2693" w:type="dxa"/><w:tcBorders><w:bottom w:val="single" w:sz="2" w:space="0" w:color="CFCFCF"/></w:tcBorders><w:tcMar><w:top w:w="60" w:type="dxa"/><w:bottom w:w="60" w:type="dxa"/></w:tcMar><w:vAlign w:val="center"/></w:tcPr><w:p><w:pPr><w:spacing w:line="190" w:lineRule="exact"/></w:pPr><w:r><w:rPr><w:color w:val="6E6E6E"/><w:spacing w:val="14"/><w:sz w:val="12"/><w:szCs w:val="12"/></w:rPr><w:t>TELEFONE</w:t></w:r></w:p><w:p><w:pPr><w:spacing w:line="200" w:lineRule="exact"/></w:pPr><w:r><w:rPr><w:b/><w:bCs/><w:color w:val="000000"/><w:sz w:val="16"/><w:szCs w:val="16"/></w:rPr><w:t>{TELEFONE_COMPRADOR}</w:t></w:r></w:p></w:tc><w:tc><w:tcPr><w:tcW w:w="2693" w:type="dxa"/><w:tcBorders><w:bottom w:val="single" w:sz="2" w:space="0" w:color="CFCFCF"/></w:tcBorders><w:tcMar><w:top w:w="60" w:type="dxa"/><w:bottom w:w="60" w:type="dxa"/></w:tcMar><w:vAlign w:val="center"/></w:tcPr><w:p><w:pPr><w:spacing w:line="190" w:lineRule="exact"/></w:pPr><w:r><w:rPr><w:color w:val="6E6E6E"/><w:spacing w:val="14"/><w:sz w:val="12"/><w:szCs w:val="12"/></w:rPr><w:t>CIDADE / UF</w:t></w:r></w:p><w:p><w:pPr><w:spacing w:line="200" w:lineRule="exact"/></w:pPr><w:r><w:rPr><w:b/><w:bCs/><w:color w:val="000000"/><w:sz w:val="16"/><w:szCs w:val="16"/></w:rPr><w:t>Guarapari / ES</w:t></w:r></w:p></w:tc><w:tc><w:tcPr><w:tcW w:w="2692" w:type="dxa"/><w:tcBorders><w:bottom w:val="single" w:sz="2" w:space="0" w:color="CFCFCF"/></w:tcBorders><w:tcMar><w:top w:w="60" w:type="dxa"/><w:bottom w:w="60" w:type="dxa"/></w:tcMar><w:vAlign w:val="center"/></w:tcPr><w:p><w:pPr><w:spacing w:line="190" w:lineRule="exact"/></w:pPr><w:r><w:rPr><w:color w:val="6E6E6E"/><w:spacing w:val="14"/><w:sz w:val="12"/><w:szCs w:val="12"/></w:rPr><w:t>CEP</w:t></w:r></w:p><w:p><w:pPr><w:spacing w:line="200" w:lineRule="exact"/></w:pPr><w:r><w:rPr><w:b/><w:bCs/><w:color w:val="000000"/><w:sz w:val="16"/><w:szCs w:val="16"/></w:rPr><w:t>{CEP_COMPRADOR}</w:t></w:r></w:p></w:tc></w:tr><w:tr><w:tc><w:tcPr><w:tcW w:w="10771" w:type="dxa"/><w:gridSpan w:val="4"/><w:tcBorders><w:bottom w:val="single" w:sz="2" w:space="0" w:color="CFCFCF"/></w:tcBorders><w:tcMar><w:top w:w="60" w:type="dxa"/><w:bottom w:w="60" w:type="dxa"/></w:tcMar><w:vAlign w:val="center"/></w:tcPr><w:p><w:pPr><w:spacing w:line="190" w:lineRule="exact"/></w:pPr><w:r><w:rPr><w:color w:val="6E6E6E"/><w:spacing w:val="14"/><w:sz w:val="12"/><w:szCs w:val="12"/></w:rPr><w:t>ENDEREÇO</w:t></w:r></w:p><w:p><w:pPr><w:spacing w:line="200" w:lineRule="exact"/></w:pPr><w:r><w:rPr><w:b/><w:bCs/><w:color w:val="000000"/><w:sz w:val="16"/><w:szCs w:val="16"/></w:rPr><w:t>Rua Manaus, 10 — Camurugi</w:t></w:r></w:p></w:tc></w:tr></w:tbl><w:p><w:pPr><w:spacing w:after="60"/></w:pPr></w:p><w:tbl><w:tblPr><w:tblW w:w="10772" w:type="dxa"/><w:tblLayout w:type="fixed"/><w:tblCellMar><w:top w:w="50" w:type="dxa"/><w:left w:w="110" w:type="dxa"/><w:bottom w:w="50" w:type="dxa"/><w:right w:w="110" w:type="dxa"/></w:tblCellMar><w:tblLook w:val="04A0" w:firstRow="1" w:lastRow="0" w:firstColumn="1" w:lastColumn="0" w:noHBand="0" w:noVBand="1"/></w:tblPr><w:tblGrid><w:gridCol w:w="2694"/><w:gridCol w:w="2693"/><w:gridCol w:w="2693"/><w:gridCol w:w="2692"/></w:tblGrid><w:tr><w:tc><w:tcPr><w:tcW w:w="10771" w:type="dxa"/><w:gridSpan w:val="4"/><w:shd w:val="clear" w:color="auto" w:fill="000000"/></w:tcPr><w:p><w:r><w:rPr><w:b/><w:bCs/><w:color w:val="FFFFFF"/><w:spacing w:val="26"/></w:rPr><w:t>3. IDENTIFICAÇÃO DO VEÍCULO</w:t></w:r></w:p></w:tc></w:tr><w:tr><w:tc><w:tcPr><w:tcW w:w="2693" w:type="dxa"/><w:tcBorders><w:bottom w:val="single" w:sz="2" w:space="0" w:color="CFCFCF"/></w:tcBorders><w:tcMar><w:top w:w="60" w:type="dxa"/><w:bottom w:w="60" w:type="dxa"/></w:tcMar><w:vAlign w:val="center"/></w:tcPr><w:p><w:pPr><w:spacing w:line="190" w:lineRule="exact"/></w:pPr><w:r><w:rPr><w:color w:val="6E6E6E"/><w:spacing w:val="14"/><w:sz w:val="12"/><w:szCs w:val="12"/></w:rPr><w:t>MARCA</w:t></w:r></w:p><w:p><w:pPr><w:spacing w:line="200" w:lineRule="exact"/></w:pPr><w:r><w:rPr><w:b/><w:bCs/><w:color w:val="000000"/><w:sz w:val="16"/><w:szCs w:val="16"/></w:rPr><w:t>{MARCA}</w:t></w:r></w:p></w:tc><w:tc><w:tcPr><w:tcW w:w="2693" w:type="dxa"/><w:tcBorders><w:bottom w:val="single" w:sz="2" w:space="0" w:color="CFCFCF"/></w:tcBorders><w:tcMar><w:top w:w="60" w:type="dxa"/><w:bottom w:w="60" w:type="dxa"/></w:tcMar><w:vAlign w:val="center"/></w:tcPr><w:p><w:pPr><w:spacing w:line="190" w:lineRule="exact"/></w:pPr><w:r><w:rPr><w:color w:val="6E6E6E"/><w:spacing w:val="14"/><w:sz w:val="12"/><w:szCs w:val="12"/></w:rPr><w:t>MODELO</w:t></w:r></w:p><w:p><w:pPr><w:spacing w:line="200" w:lineRule="exact"/></w:pPr><w:r><w:rPr><w:b/><w:bCs/><w:color w:val="000000"/><w:sz w:val="16"/><w:szCs w:val="16"/></w:rPr><w:t>{MODELO}</w:t></w:r></w:p></w:tc><w:tc><w:tcPr><w:tcW w:w="2693" w:type="dxa"/><w:tcBorders><w:bottom w:val="single" w:sz="2" w:space="0" w:color="CFCFCF"/></w:tcBorders><w:tcMar><w:top w:w="60" w:type="dxa"/><w:bottom w:w="60" w:type="dxa"/></w:tcMar><w:vAlign w:val="center"/></w:tcPr><w:p><w:pPr><w:spacing w:line="190" w:lineRule="exact"/></w:pPr><w:r><w:rPr><w:color w:val="6E6E6E"/><w:spacing w:val="14"/><w:sz w:val="12"/><w:szCs w:val="12"/></w:rPr><w:t>ANO / MODELO</w:t></w:r></w:p><w:p><w:pPr><w:spacing w:line="200" w:lineRule="exact"/></w:pPr><w:r><w:rPr><w:b/><w:bCs/><w:color w:val="000000"/><w:sz w:val="16"/><w:szCs w:val="16"/></w:rPr><w:t>{ANO_FAB_MOD}</w:t></w:r></w:p></w:tc><w:tc><w:tcPr><w:tcW w:w="2692" w:type="dxa"/><w:tcBorders><w:bottom w:val="single" w:sz="2" w:space="0" w:color="CFCFCF"/></w:tcBorders><w:tcMar><w:top w:w="60" w:type="dxa"/><w:bottom w:w="60" w:type="dxa"/></w:tcMar><w:vAlign w:val="center"/></w:tcPr><w:p><w:pPr><w:spacing w:line="190" w:lineRule="exact"/></w:pPr><w:r><w:rPr><w:color w:val="6E6E6E"/><w:spacing w:val="14"/><w:sz w:val="12"/><w:szCs w:val="12"/></w:rPr><w:t>COMBUSTÍVEL</w:t></w:r></w:p><w:p><w:pPr><w:spacing w:line="200" w:lineRule="exact"/></w:pPr><w:r><w:rPr><w:b/><w:bCs/><w:color w:val="000000"/><w:sz w:val="16"/><w:szCs w:val="16"/></w:rPr><w:t>{COMBUSTIVEL}</w:t></w:r></w:p></w:tc></w:tr><w:tr><w:tc><w:tcPr><w:tcW w:w="2693" w:type="dxa"/><w:tcBorders><w:bottom w:val="single" w:sz="2" w:space="0" w:color="CFCFCF"/></w:tcBorders><w:tcMar><w:top w:w="60" w:type="dxa"/><w:bottom w:w="60" w:type="dxa"/></w:tcMar><w:vAlign w:val="center"/></w:tcPr><w:p><w:pPr><w:spacing w:line="190" w:lineRule="exact"/></w:pPr><w:r><w:rPr><w:color w:val="6E6E6E"/><w:spacing w:val="14"/><w:sz w:val="12"/><w:szCs w:val="12"/></w:rPr><w:t>COR</w:t></w:r></w:p><w:p><w:pPr><w:spacing w:line="200" w:lineRule="exact"/></w:pPr><w:r><w:rPr><w:b/><w:bCs/><w:color w:val="000000"/><w:sz w:val="16"/><w:szCs w:val="16"/></w:rPr><w:t>{COR}</w:t></w:r></w:p></w:tc><w:tc><w:tcPr><w:tcW w:w="2693" w:type="dxa"/><w:tcBorders><w:bottom w:val="single" w:sz="2" w:space="0" w:color="CFCFCF"/></w:tcBorders><w:tcMar><w:top w:w="60" w:type="dxa"/><w:bottom w:w="60" w:type="dxa"/></w:tcMar><w:vAlign w:val="center"/></w:tcPr><w:p><w:pPr><w:spacing w:line="190" w:lineRule="exact"/></w:pPr><w:r><w:rPr><w:color w:val="6E6E6E"/><w:spacing w:val="14"/><w:sz w:val="12"/><w:szCs w:val="12"/></w:rPr><w:t>QUILOMETRAGEM</w:t></w:r></w:p><w:p><w:pPr><w:spacing w:line="200" w:lineRule="exact"/></w:pPr><w:r><w:rPr><w:b/><w:bCs/><w:color w:val="000000"/><w:sz w:val="16"/><w:szCs w:val="16"/></w:rPr><w:t>{QUILOMETRAGEM}</w:t></w:r></w:p></w:tc><w:tc><w:tcPr><w:tcW w:w="2693" w:type="dxa"/><w:tcBorders><w:bottom w:val="single" w:sz="2" w:space="0" w:color="CFCFCF"/></w:tcBorders><w:tcMar><w:top w:w="60" w:type="dxa"/><w:bottom w:w="60" w:type="dxa"/></w:tcMar><w:vAlign w:val="center"/></w:tcPr><w:p><w:pPr><w:spacing w:line="190" w:lineRule="exact"/></w:pPr><w:r><w:rPr><w:color w:val="6E6E6E"/><w:spacing w:val="14"/><w:sz w:val="12"/><w:szCs w:val="12"/></w:rPr><w:t>PLACA</w:t></w:r></w:p><w:p><w:pPr><w:spacing w:line="200" w:lineRule="exact"/></w:pPr><w:r><w:rPr><w:b/><w:bCs/><w:color w:val="000000"/><w:sz w:val="16"/><w:szCs w:val="16"/></w:rPr><w:t>{PLACA}</w:t></w:r></w:p></w:tc><w:tc><w:tcPr><w:tcW w:w="2692" w:type="dxa"/><w:tcBorders><w:bottom w:val="single" w:sz="2" w:space="0" w:color="CFCFCF"/></w:tcBorders><w:tcMar><w:top w:w="60" w:type="dxa"/><w:bottom w:w="60" w:type="dxa"/></w:tcMar><w:vAlign w:val="center"/></w:tcPr><w:p><w:pPr><w:spacing w:line="190" w:lineRule="exact"/></w:pPr><w:r><w:rPr><w:color w:val="6E6E6E"/><w:spacing w:val="14"/><w:sz w:val="12"/><w:szCs w:val="12"/></w:rPr><w:t>RENAVAM</w:t></w:r></w:p><w:p><w:pPr><w:spacing w:line="200" w:lineRule="exact"/></w:pPr><w:r><w:rPr><w:b/><w:bCs/><w:color w:val="000000"/><w:sz w:val="16"/><w:szCs w:val="16"/></w:rPr><w:t>{RENAVAM}</w:t></w:r></w:p></w:tc></w:tr><w:tr><w:tc><w:tcPr><w:tcW w:w="5386" w:type="dxa"/><w:gridSpan w:val="2"/><w:tcBorders><w:bottom w:val="single" w:sz="2" w:space="0" w:color="CFCFCF"/></w:tcBorders><w:tcMar><w:top w:w="60" w:type="dxa"/><w:bottom w:w="60" w:type="dxa"/></w:tcMar><w:vAlign w:val="center"/></w:tcPr><w:p><w:pPr><w:spacing w:line="190" w:lineRule="exact"/></w:pPr><w:r><w:rPr><w:color w:val="6E6E6E"/><w:spacing w:val="14"/><w:sz w:val="12"/><w:szCs w:val="12"/></w:rPr><w:t>CHASSI</w:t></w:r></w:p><w:p><w:pPr><w:spacing w:line="200" w:lineRule="exact"/></w:pPr><w:r><w:rPr><w:b/><w:bCs/><w:color w:val="000000"/><w:sz w:val="16"/><w:szCs w:val="16"/></w:rPr><w:t>{CHASSI}</w:t></w:r></w:p></w:tc><w:tc><w:tcPr><w:tcW w:w="5385" w:type="dxa"/><w:gridSpan w:val="2"/><w:tcBorders><w:bottom w:val="single" w:sz="2" w:space="0" w:color="CFCFCF"/></w:tcBorders><w:tcMar><w:top w:w="60" w:type="dxa"/><w:bottom w:w="60" w:type="dxa"/></w:tcMar><w:vAlign w:val="center"/></w:tcPr><w:p><w:pPr><w:spacing w:line="190" w:lineRule="exact"/></w:pPr><w:r><w:rPr><w:color w:val="6E6E6E"/><w:spacing w:val="14"/><w:sz w:val="12"/><w:szCs w:val="12"/></w:rPr><w:t>TIPO</w:t></w:r></w:p><w:p><w:pPr><w:spacing w:line="200" w:lineRule="exact"/></w:pPr><w:r><w:rPr><w:b/><w:bCs/><w:color w:val="000000"/><w:sz w:val="16"/><w:szCs w:val="16"/></w:rPr><w:t>{TIPO_VEICULO}</w:t></w:r></w:p></w:tc></w:tr></w:tbl><w:p><w:pPr><w:spacing w:after="60"/></w:pPr></w:p><w:tbl><w:tblPr><w:tblW w:w="10772" w:type="dxa"/><w:tblLayout w:type="fixed"/><w:tblCellMar><w:top w:w="50" w:type="dxa"/><w:left w:w="110" w:type="dxa"/><w:bottom w:w="50" w:type="dxa"/><w:right w:w="110" w:type="dxa"/></w:tblCellMar><w:tblLook w:val="04A0" w:firstRow="1" w:lastRow="0" w:firstColumn="1" w:lastColumn="0" w:noHBand="0" w:noVBand="1"/></w:tblPr><w:tblGrid><w:gridCol w:w="10772"/></w:tblGrid><w:tr><w:tc><w:tcPr><w:tcW w:w="10772" w:type="dxa"/><w:shd w:val="clear" w:color="auto" w:fill="000000"/></w:tcPr><w:p><w:pPr><w:rPr><w:lang w:val="pt-BR"/></w:rPr></w:pPr><w:r><w:rPr><w:b/><w:bCs/><w:color w:val="FFFFFF"/><w:spacing w:val="26"/><w:lang w:val="pt-BR"/></w:rPr><w:t>4. VALOR E CONDIÇÕES DE PAGAMENTO</w:t></w:r></w:p></w:tc></w:tr><w:tr><w:tc><w:tcPr><w:tcW w:w="10772" w:type="dxa"/><w:shd w:val="clear" w:color="auto" w:fill="F0F0F0"/><w:tcMar><w:top w:w="90" w:type="dxa"/><w:left w:w="130" w:type="dxa"/><w:bottom w:w="90" w:type="dxa"/><w:right w:w="130" w:type="dxa"/></w:tcMar></w:tcPr><w:p><w:pPr><w:spacing w:line="220" w:lineRule="exact"/><w:rPr><w:lang w:val="pt-BR"/></w:rPr></w:pPr><w:r><w:rPr><w:color w:val="6E6E6E"/><w:spacing w:val="30"/><w:sz w:val="13"/><w:szCs w:val="13"/><w:lang w:val="pt-BR"/></w:rPr><w:t xml:space="preserve">VALOR TOTAL DA VENDA    </w:t></w:r><w:r><w:rPr><w:b/><w:bCs/><w:color w:val="000000"/><w:sz w:val="24"/><w:szCs w:val="24"/><w:lang w:val="pt-BR"/></w:rPr><w:t>R$ {VALOR_NUMERICO}</w:t></w:r><w:r><w:rPr><w:color w:val="6E6E6E"/><w:sz w:val="14"/><w:szCs w:val="14"/><w:lang w:val="pt-BR"/></w:rPr><w:t xml:space="preserve">   {VALOR_EXTENSO}</w:t></w:r></w:p></w:tc></w:tr><w:tr><w:tc><w:tcPr><w:tcW w:w="10772" w:type="dxa"/><w:tcBorders><w:bottom w:val="single" w:sz="2" w:space="0" w:color="CFCFCF"/></w:tcBorders><w:tcMar><w:top w:w="90" w:type="dxa"/><w:left w:w="130" w:type="dxa"/><w:bottom w:w="90" w:type="dxa"/><w:right w:w="130" w:type="dxa"/></w:tcMar></w:tcPr><w:p><w:p><w:pPr><w:spacing w:after="20" w:line="200" w:lineRule="exact"/><w:jc w:val="both"/><w:rPr><w:lang w:val="pt-BR"/></w:rPr></w:pPr>{@CONDICOES_XML}</w:p></w:tc></w:tr></w:tbl><w:p><w:pPr><w:spacing w:after="60"/><w:rPr><w:lang w:val="pt-BR"/></w:rPr></w:pPr></w:p><w:tbl><w:tblPr><w:tblW w:w="10772" w:type="dxa"/><w:tblLayout w:type="fixed"/><w:tblCellMar><w:top w:w="50" w:type="dxa"/><w:left w:w="110" w:type="dxa"/><w:bottom w:w="50" w:type="dxa"/><w:right w:w="110" w:type="dxa"/></w:tblCellMar><w:tblLook w:val="04A0" w:firstRow="1" w:lastRow="0" w:firstColumn="1" w:lastColumn="0" w:noHBand="0" w:noVBand="1"/></w:tblPr><w:tblGrid><w:gridCol w:w="10772"/></w:tblGrid><w:tr><w:tc><w:tcPr><w:tcW w:w="10772" w:type="dxa"/><w:shd w:val="clear" w:color="auto" w:fill="000000"/></w:tcPr><w:p><w:r><w:rPr><w:b/><w:bCs/><w:color w:val="FFFFFF"/><w:spacing w:val="26"/></w:rPr><w:t>5. CLÁUSULAS CONTRATUAIS</w:t></w:r></w:p></w:tc></w:tr></w:tbl><w:p><w:pPr><w:spacing w:before="70" w:line="200" w:lineRule="exact"/><w:jc w:val="both"/><w:rPr><w:lang w:val="pt-BR"/></w:rPr></w:pPr><w:r><w:rPr><w:lang w:val="pt-BR"/></w:rPr><w:t>Pelo presente instrumento particular de contrato de compra e venda de veículo, firmado pelas partes acima qualificadas, aqui denominadas simplesmente VENDEDOR e COMPRADOR, é justo e contratado o seguinte:</w:t></w:r></w:p><w:p><w:pPr><w:spacing w:before="26" w:line="200" w:lineRule="exact"/><w:jc w:val="both"/><w:rPr><w:lang w:val="pt-BR"/></w:rPr></w:pPr><w:r><w:rPr><w:b/><w:bCs/><w:color w:val="000000"/><w:lang w:val="pt-BR"/></w:rPr><w:t xml:space="preserve">Cláusula 1ª — Objeto. </w:t></w:r><w:r><w:rPr><w:lang w:val="pt-BR"/></w:rPr><w:t>O VENDEDOR vende e transfere ao COMPRADOR a propriedade do bem objeto do presente instrumento, pelo preço certo e ajustado entre as partes, acima indicado.</w:t></w:r></w:p><w:p><w:pPr><w:spacing w:before="26" w:line="200" w:lineRule="exact"/><w:ind w:left="220"/><w:jc w:val="both"/><w:rPr><w:lang w:val="pt-BR"/></w:rPr></w:pPr><w:r><w:rPr><w:b/><w:bCs/><w:color w:val="000000"/><w:lang w:val="pt-BR"/></w:rPr><w:t xml:space="preserve">Parágrafo Primeiro. </w:t></w:r><w:r><w:rPr><w:lang w:val="pt-BR"/></w:rPr><w:t>O COMPRADOR declara neste ato que examinou criteriosamente o veículo acima indicado em todos os seus itens e componentes, verificando o motor, a lataria e o estado geral do mesmo, razão pela qual o adquire no estado em que se apresenta.</w:t></w:r></w:p><w:p><w:pPr><w:spacing w:before="26" w:line="200" w:lineRule="exact"/><w:jc w:val="both"/><w:rPr><w:lang w:val="pt-BR"/></w:rPr></w:pPr><w:r><w:rPr><w:b/><w:bCs/><w:color w:val="000000"/><w:lang w:val="pt-BR"/></w:rPr><w:t xml:space="preserve">Cláusula 2ª — Responsabilidade a partir da assinatura. </w:t></w:r><w:r><w:rPr><w:lang w:val="pt-BR"/></w:rPr><w:t>O VENDEDOR estará isento de responder administrativa, civil ou penalmente por qualquer evento ocorrido a partir da data da assinatura do presente contrato, sendo que responde por todos aqueles anteriores.</w:t></w:r></w:p><w:p><w:pPr><w:spacing w:before="26" w:line="200" w:lineRule="exact"/><w:jc w:val="both"/><w:rPr><w:lang w:val="pt-BR"/></w:rPr></w:pPr><w:r><w:rPr><w:b/><w:bCs/><w:color w:val="000000"/><w:lang w:val="pt-BR"/></w:rPr><w:t xml:space="preserve">Cláusula 3ª — Entrega livre de ônus. </w:t></w:r><w:r><w:rPr><w:lang w:val="pt-BR"/></w:rPr><w:t>O VENDEDOR se obriga a entregar o referido bem livre de qualquer ônus, principalmente os que se referem aos débitos de multas, IPVA, licenciamento e seguro obrigatório, devidos até a data da venda, inclusive no que diz respeito às multas que ainda não tenham sido cadastradas ou notificadas.</w:t></w:r></w:p><w:p><w:pPr><w:spacing w:before="26" w:line="200" w:lineRule="exact"/><w:jc w:val="both"/><w:rPr><w:lang w:val="pt-BR"/></w:rPr></w:pPr><w:r><w:rPr><w:b/><w:bCs/><w:color w:val="000000"/><w:lang w:val="pt-BR"/></w:rPr><w:t xml:space="preserve">Cláusula 4ª — Despesas de transferência e financiamento. </w:t></w:r><w:r><w:rPr><w:lang w:val="pt-BR"/></w:rPr><w:t>As despesas com a transferência da propriedade e com o financiamento são de responsabilidade exclusiva do COMPRADOR.</w:t></w:r></w:p><w:p><w:pPr><w:spacing w:before="26" w:line="200" w:lineRule="exact"/><w:jc w:val="both"/><w:rPr><w:lang w:val="pt-BR"/></w:rPr></w:pPr><w:r><w:rPr><w:b/><w:bCs/><w:color w:val="000000"/><w:lang w:val="pt-BR"/></w:rPr><w:t xml:space="preserve">Cláusula 5ª — Informações prestadas ao comprador. </w:t></w:r><w:r><w:rPr><w:lang w:val="pt-BR"/></w:rPr><w:t>O COMPRADOR foi previamente informado pelo VENDEDOR no que diz respeito ao valor dos tributos incidentes sobre a comercialização do veículo e à regularidade do veículo quanto a furto, multas e taxas anuais legalmente devidas, débitos de impostos, alienação fiduciária e quaisquer outros registros que limitem ou impeçam a circulação do veículo.</w:t></w:r></w:p><w:p><w:pPr><w:spacing w:before="26" w:line="200" w:lineRule="exact"/><w:jc w:val="both"/><w:rPr><w:lang w:val="pt-BR"/></w:rPr></w:pPr><w:r><w:rPr><w:b/><w:bCs/><w:color w:val="000000"/><w:lang w:val="pt-BR"/></w:rPr><w:t xml:space="preserve">Cláusula 6ª — Foro. </w:t></w:r><w:r><w:rPr><w:lang w:val="pt-BR"/></w:rPr><w:t>Fica eleito o foro da Comarca de Guarapari, Estado do Espírito Santo, para dirimir quaisquer dúvidas ou litígios decorrentes deste contrato, com renúncia expressa de qualquer outro, por mais privilegiado que seja.</w:t></w:r></w:p><w:p><w:pPr><w:spacing w:before="26" w:line="200" w:lineRule="exact"/><w:jc w:val="both"/><w:rPr><w:lang w:val="pt-BR"/></w:rPr></w:pPr><w:r><w:rPr><w:b/><w:bCs/><w:color w:val="000000"/><w:lang w:val="pt-BR"/></w:rPr><w:t xml:space="preserve">Cláusula 7ª — Garantia. </w:t></w:r><w:r><w:rPr><w:lang w:val="pt-BR"/></w:rPr><w:t>A garantia do veículo será feita conforme o Código de Defesa do Consumidor.</w:t></w:r></w:p><w:p><w:pPr><w:spacing w:before="26" w:line="200" w:lineRule="exact"/><w:jc w:val="both"/><w:rPr><w:lang w:val="pt-BR"/></w:rPr></w:pPr><w:r><w:rPr><w:b/><w:bCs/><w:color w:val="000000"/><w:lang w:val="pt-BR"/></w:rPr><w:t xml:space="preserve">Cláusula 8ª — Seguros vinculados ao financiamento. </w:t></w:r><w:r><w:rPr><w:lang w:val="pt-BR"/></w:rPr><w:t>O contrato de financiamento deste veículo possui os seguintes seguros inclusos: {SEGUROS_LISTA}, no valor total de R$ {SEGUROS_VALOR}.</w:t></w:r></w:p><w:p><w:pPr><w:spacing w:before="26" w:line="200" w:lineRule="exact"/><w:ind w:left="220"/><w:jc w:val="both"/><w:rPr><w:lang w:val="pt-BR"/></w:rPr></w:pPr><w:r><w:rPr><w:b/><w:bCs/><w:color w:val="000000"/><w:lang w:val="pt-BR"/></w:rPr><w:t xml:space="preserve">Parágrafo Único. </w:t></w:r><w:r><w:rPr><w:lang w:val="pt-BR"/></w:rPr><w:t>[   ] do financiamento por parte do COMPRADOR, o mesmo se responsabiliza em quitar todas as despesas referentes ao processo de retirada do gravame.</w:t></w:r></w:p><w:p><w:pPr><w:spacing w:before="26" w:line="200" w:lineRule="exact"/><w:jc w:val="both"/><w:rPr><w:lang w:val="pt-BR"/></w:rPr></w:pPr><w:r><w:rPr><w:b/><w:bCs/><w:color w:val="000000"/><w:lang w:val="pt-BR"/></w:rPr><w:t xml:space="preserve">Cláusula 9ª — Disposições finais. </w:t></w:r><w:r><w:rPr><w:lang w:val="pt-BR"/></w:rPr><w:t>O veículo não possui chave reserva. A garantia só terá efeito quando o veículo for analisado por mecânicos desta empresa, perdendo-se a garantia em caso de qualquer serviço realizado por terceiros.</w:t></w:r></w:p><w:p><w:pPr><w:spacing w:before="80" w:line="200" w:lineRule="exact"/><w:jc w:val="both"/><w:rPr><w:lang w:val="pt-BR"/></w:rPr></w:pPr><w:r><w:rPr><w:lang w:val="pt-BR"/></w:rPr><w:t>E por estarem assim acordados, firmam o presente instrumento em 02 (duas) vias de igual teor e forma, obrigando-se as partes por si, seus herdeiros e sucessores, elegendo o foro desta cidade para dirimir quaisquer dúvidas ou pendências.</w:t></w:r></w:p><w:p><w:pPr><w:spacing w:before="90" w:line="200" w:lineRule="exact"/><w:jc w:val="right"/><w:rPr><w:lang w:val="pt-BR"/></w:rPr></w:pPr><w:r><w:rPr><w:b/><w:bCs/><w:color w:val="000000"/><w:lang w:val="pt-BR"/></w:rPr><w:t>Guarapari / ES, {DATA_CONTRATO_EXTENSO}.</w:t></w:r></w:p><w:tbl><w:tblPr><w:tblW w:w="10772" w:type="dxa"/><w:tblLayout w:type="fixed"/><w:tblCellMar><w:left w:w="420" w:type="dxa"/><w:right w:w="420" w:type="dxa"/></w:tblCellMar><w:tblLook w:val="04A0" w:firstRow="1" w:lastRow="0" w:firstColumn="1" w:lastColumn="0" w:noHBand="0" w:noVBand="1"/></w:tblPr><w:tblGrid><w:gridCol w:w="5387"/><w:gridCol w:w="5385"/></w:tblGrid><w:tr><w:tc><w:tcPr><w:tcW w:w="5386" w:type="dxa"/></w:tcPr><w:p><w:pPr><w:pBdr><w:top w:val="single" w:sz="6" w:space="0" w:color="000000"/></w:pBdr><w:spacing w:before="400" w:after="40"/><w:rPr><w:lang w:val="pt-BR"/></w:rPr></w:pPr></w:p><w:p><w:pPr><w:spacing w:line="200" w:lineRule="exact"/><w:jc w:val="center"/><w:rPr><w:lang w:val="pt-BR"/></w:rPr></w:pPr><w:r><w:rPr><w:b/><w:bCs/><w:color w:val="000000"/><w:sz w:val="14"/><w:szCs w:val="14"/><w:lang w:val="pt-BR"/></w:rPr><w:t>R C P VEÍCULOS EIRELI</w:t></w:r></w:p><w:p><w:pPr><w:spacing w:line="200" w:lineRule="exact"/><w:jc w:val="center"/><w:rPr><w:lang w:val="pt-BR"/></w:rPr></w:pPr><w:r><w:rPr><w:color w:val="6E6E6E"/><w:spacing w:val="14"/><w:sz w:val="12"/><w:szCs w:val="12"/><w:lang w:val="pt-BR"/></w:rPr><w:t>VENDEDOR</w:t></w:r></w:p></w:tc><w:tc><w:tcPr><w:tcW w:w="5385" w:type="dxa"/></w:tcPr><w:p><w:pPr><w:pBdr><w:top w:val="single" w:sz="6" w:space="0" w:color="000000"/></w:pBdr><w:spacing w:before="400" w:after="40"/><w:rPr><w:lang w:val="pt-BR"/></w:rPr></w:pPr></w:p><w:p><w:pPr><w:spacing w:line="200" w:lineRule="exact"/><w:jc w:val="center"/><w:rPr><w:lang w:val="pt-BR"/></w:rPr></w:pPr><w:r><w:rPr><w:b/><w:bCs/><w:color w:val="000000"/><w:sz w:val="14"/><w:szCs w:val="14"/><w:lang w:val="pt-BR"/></w:rPr><w:t>{NOME_COMPRADOR}</w:t></w:r></w:p><w:p><w:pPr><w:spacing w:line="200" w:lineRule="exact"/><w:jc w:val="center"/><w:rPr><w:lang w:val="pt-BR"/></w:rPr></w:pPr><w:r><w:rPr><w:color w:val="6E6E6E"/><w:spacing w:val="14"/><w:sz w:val="12"/><w:szCs w:val="12"/><w:lang w:val="pt-BR"/></w:rPr><w:t>COMPRADOR</w:t></w:r></w:p></w:tc></w:tr></w:tbl><w:p><w:pPr><w:rPr><w:lang w:val="pt-BR"/></w:rPr></w:pPr></w:p><w:sectPr><w:pgSz w:w="11906" w:h="16838"/><w:pgMar w:top="420" w:right="567" w:bottom="340" w:left="567" w:header="0" w:footer="0" w:gutter="0"/><w:cols w:space="720"/><w:formProt w:val="0"/><w:docGrid w:linePitch="360" w:charSpace="18431"/></w:sectPr></w:body></w:document>
+<file path=word/document.xml><?xml version="1.0" encoding="utf-8"?>
+<w:document xmlns:wpc="http://schemas.microsoft.com/office/word/2010/wordprocessingCanvas" xmlns:cx="http://schemas.microsoft.com/office/drawing/2014/chartex" xmlns:cx1="http://schemas.microsoft.com/office/drawing/2015/9/8/chartex" xmlns:cx2="http://schemas.microsoft.com/office/drawing/2015/10/21/chartex" xmlns:cx3="http://schemas.microsoft.com/office/drawing/2016/5/9/chartex" xmlns:cx4="http://schemas.microsoft.com/office/drawing/2016/5/10/chartex" xmlns:cx5="http://schemas.microsoft.com/office/drawing/2016/5/11/chartex" xmlns:cx6="http://schemas.microsoft.com/office/drawing/2016/5/12/chartex" xmlns:cx7="http://schemas.microsoft.com/office/drawing/2016/5/13/chartex" xmlns:cx8="http://schemas.microsoft.com/office/drawing/2016/5/14/chartex" xmlns:mc="http://schemas.openxmlformats.org/markup-compatibility/2006" xmlns:aink="http://schemas.microsoft.com/office/drawing/2016/ink" xmlns:am3d="http://schemas.microsoft.com/office/drawing/2017/model3d" xmlns:o="urn:schemas-microsoft-com:office:office" xmlns:oel="http://schemas.microsoft.com/office/2019/extlst" xmlns:r="http://schemas.openxmlformats.org/officeDocument/2006/relationships" xmlns:m="http://schemas.openxmlformats.org/officeDocument/2006/math" xmlns:v="urn:schemas-microsoft-com:vml" xmlns:wp14="http://schemas.microsoft.com/office/word/2010/wordprocessingDrawing" xmlns:wp="http://schemas.openxmlformats.org/drawingml/2006/wordprocessingDrawing" xmlns:w10="urn:schemas-microsoft-com:office:word" xmlns:w="http://schemas.openxmlformats.org/wordprocessingml/2006/main" xmlns:w14="http://schemas.microsoft.com/office/word/2010/wordml" xmlns:w15="http://schemas.microsoft.com/office/word/2012/wordml" xmlns:w16cex="http://schemas.microsoft.com/office/word/2018/wordml/cex" xmlns:w16cid="http://schemas.microsoft.com/office/word/2016/wordml/cid" xmlns:w16="http://schemas.microsoft.com/office/word/2018/wordml" xmlns:w16du="http://schemas.microsoft.com/office/word/2023/wordml/word16du" xmlns:w16sdtdh="http://schemas.microsoft.com/office/word/2020/wordml/sdtdatahash" xmlns:w16sdtfl="http://schemas.microsoft.com/office/word/2024/wordml/sdtformatlock" xmlns:w16se="http://schemas.microsoft.com/office/word/2015/wordml/symex" xmlns:wpg="http://schemas.microsoft.com/office/word/2010/wordprocessingGroup" xmlns:wpi="http://schemas.microsoft.com/office/word/2010/wordprocessingInk" xmlns:wne="http://schemas.microsoft.com/office/word/2006/wordml" xmlns:wps="http://schemas.microsoft.com/office/word/2010/wordprocessingShape" mc:Ignorable="w14 w15 w16se w16cid w16 w16cex w16sdtdh w16sdtfl w16du wp14">
+  <w:body>
+    <w:tbl>
+      <w:tblPr>
+        <w:tblW w:w="10772" w:type="dxa"/>
+        <w:tblLayout w:type="fixed"/>
+        <w:tblLook w:val="04A0" w:firstRow="1" w:lastRow="0" w:firstColumn="1" w:lastColumn="0" w:noHBand="0" w:noVBand="1"/>
+      </w:tblPr>
+      <w:tblGrid>
+        <w:gridCol w:w="4200"/>
+        <w:gridCol w:w="6572"/>
+      </w:tblGrid>
+      <w:tr>
+        <w:tc>
+          <w:tcPr>
+            <w:tcW w:w="4200" w:type="dxa"/>
+            <w:vAlign w:val="center"/>
+          </w:tcPr>
+          <w:p>
+            <w:r>
+              <w:rPr>
+                <w:noProof/>
+              </w:rPr>
+              <w:drawing>
+                <wp:inline distT="0" distB="0" distL="0" distR="0" wp14:anchorId="7FDF00C7" wp14:editId="292DBDD1">
+                  <wp:extent cx="1447800" cy="542925"/>
+                  <wp:effectExtent l="0" t="0" r="0" b="0"/>
+                  <wp:docPr id="1" name="Image1"/>
+                  <wp:cNvGraphicFramePr>
+                    <a:graphicFrameLocks xmlns:a="http://schemas.openxmlformats.org/drawingml/2006/main" noChangeAspect="1"/>
+                  </wp:cNvGraphicFramePr>
+                  <a:graphic xmlns:a="http://schemas.openxmlformats.org/drawingml/2006/main">
+                    <a:graphicData uri="http://schemas.openxmlformats.org/drawingml/2006/picture">
+                      <pic:pic xmlns:pic="http://schemas.openxmlformats.org/drawingml/2006/picture">
+                        <pic:nvPicPr>
+                          <pic:cNvPr id="1" name="Image1"/>
+                          <pic:cNvPicPr>
+                            <a:picLocks noChangeAspect="1" noChangeArrowheads="1"/>
+                          </pic:cNvPicPr>
+                        </pic:nvPicPr>
+                        <pic:blipFill>
+                          <a:blip r:embed="rId4"/>
+                          <a:stretch>
+                            <a:fillRect/>
+                          </a:stretch>
+                        </pic:blipFill>
+                        <pic:spPr bwMode="auto">
+                          <a:xfrm>
+                            <a:off x="0" y="0"/>
+                            <a:ext cx="1447800" cy="542925"/>
+                          </a:xfrm>
+                          <a:prstGeom prst="rect">
+                            <a:avLst/>
+                          </a:prstGeom>
+                        </pic:spPr>
+                      </pic:pic>
+                    </a:graphicData>
+                  </a:graphic>
+                </wp:inline>
+              </w:drawing>
+            </w:r>
+          </w:p>
+        </w:tc>
+        <w:tc>
+          <w:tcPr>
+            <w:tcW w:w="6571" w:type="dxa"/>
+            <w:vAlign w:val="bottom"/>
+          </w:tcPr>
+          <w:p>
+            <w:pPr>
+              <w:spacing w:line="200" w:lineRule="exact"/>
+              <w:jc w:val="right"/>
+              <w:rPr>
+                <w:lang w:val="pt-BR"/>
+              </w:rPr>
+            </w:pPr>
+            <w:r>
+              <w:rPr>
+                <w:color w:val="6E6E6E"/>
+                <w:spacing w:val="44"/>
+                <w:sz w:val="13"/>
+                <w:szCs w:val="13"/>
+                <w:lang w:val="pt-BR"/>
+              </w:rPr>
+              <w:t>CONTRATO PARTICULAR DE</w:t>
+            </w:r>
+          </w:p>
+          <w:p>
+            <w:pPr>
+              <w:spacing w:line="240" w:lineRule="exact"/>
+              <w:jc w:val="right"/>
+              <w:rPr>
+                <w:lang w:val="pt-BR"/>
+              </w:rPr>
+            </w:pPr>
+            <w:r>
+              <w:rPr>
+                <w:b/>
+                <w:bCs/>
+                <w:color w:val="000000"/>
+                <w:spacing w:val="4"/>
+                <w:sz w:val="26"/>
+                <w:szCs w:val="26"/>
+                <w:lang w:val="pt-BR"/>
+              </w:rPr>
+              <w:t>COMPRA E VENDA DE VEÍCULO</w:t>
+            </w:r>
+          </w:p>
+        </w:tc>
+      </w:tr>
+    </w:tbl>
+    <w:p>
+      <w:pPr>
+        <w:pBdr>
+          <w:bottom w:val="single" w:sz="14" w:space="0" w:color="000000"/>
+        </w:pBdr>
+        <w:spacing w:before="30" w:after="90"/>
+        <w:rPr>
+          <w:lang w:val="pt-BR"/>
+        </w:rPr>
+      </w:pPr>
+    </w:p>
+    <w:tbl>
+      <w:tblPr>
+        <w:tblW w:w="10772" w:type="dxa"/>
+        <w:tblLayout w:type="fixed"/>
+        <w:tblCellMar>
+          <w:top w:w="50" w:type="dxa"/>
+          <w:left w:w="110" w:type="dxa"/>
+          <w:bottom w:w="50" w:type="dxa"/>
+          <w:right w:w="110" w:type="dxa"/>
+        </w:tblCellMar>
+        <w:tblLook w:val="04A0" w:firstRow="1" w:lastRow="0" w:firstColumn="1" w:lastColumn="0" w:noHBand="0" w:noVBand="1"/>
+      </w:tblPr>
+      <w:tblGrid>
+        <w:gridCol w:w="5386"/>
+        <w:gridCol w:w="2693"/>
+        <w:gridCol w:w="2693"/>
+      </w:tblGrid>
+      <w:tr>
+        <w:tc>
+          <w:tcPr>
+            <w:tcW w:w="10772" w:type="dxa"/>
+            <w:gridSpan w:val="3"/>
+            <w:shd w:val="clear" w:color="auto" w:fill="000000"/>
+          </w:tcPr>
+          <w:p>
+            <w:r>
+              <w:rPr>
+                <w:b/>
+                <w:bCs/>
+                <w:color w:val="FFFFFF"/>
+                <w:spacing w:val="26"/>
+              </w:rPr>
+              <w:t>1. DADOS DO VENDEDOR</w:t>
+            </w:r>
+          </w:p>
+        </w:tc>
+      </w:tr>
+      <w:tr>
+        <w:tc>
+          <w:tcPr>
+            <w:tcW w:w="5386" w:type="dxa"/>
+            <w:tcBorders>
+              <w:bottom w:val="single" w:sz="2" w:space="0" w:color="CFCFCF"/>
+            </w:tcBorders>
+            <w:tcMar>
+              <w:top w:w="60" w:type="dxa"/>
+              <w:bottom w:w="60" w:type="dxa"/>
+            </w:tcMar>
+            <w:vAlign w:val="center"/>
+          </w:tcPr>
+          <w:p>
+            <w:pPr>
+              <w:spacing w:line="190" w:lineRule="exact"/>
+              <w:rPr>
+                <w:lang w:val="pt-BR"/>
+              </w:rPr>
+            </w:pPr>
+            <w:r>
+              <w:rPr>
+                <w:color w:val="6E6E6E"/>
+                <w:spacing w:val="14"/>
+                <w:sz w:val="12"/>
+                <w:szCs w:val="12"/>
+                <w:lang w:val="pt-BR"/>
+              </w:rPr>
+              <w:t>RAZÃO SOCIAL</w:t>
+            </w:r>
+          </w:p>
+          <w:p>
+            <w:pPr>
+              <w:spacing w:line="200" w:lineRule="exact"/>
+              <w:rPr>
+                <w:lang w:val="pt-BR"/>
+              </w:rPr>
+            </w:pPr>
+            <w:r>
+              <w:rPr>
+                <w:b/>
+                <w:bCs/>
+                <w:color w:val="000000"/>
+                <w:sz w:val="16"/>
+                <w:szCs w:val="16"/>
+                <w:lang w:val="pt-BR"/>
+              </w:rPr>
+              <w:t>R C P VEÍCULOS EIRELI</w:t>
+            </w:r>
+          </w:p>
+        </w:tc>
+        <w:tc>
+          <w:tcPr>
+            <w:tcW w:w="2693" w:type="dxa"/>
+            <w:tcBorders>
+              <w:bottom w:val="single" w:sz="2" w:space="0" w:color="CFCFCF"/>
+            </w:tcBorders>
+            <w:tcMar>
+              <w:top w:w="60" w:type="dxa"/>
+              <w:bottom w:w="60" w:type="dxa"/>
+            </w:tcMar>
+            <w:vAlign w:val="center"/>
+          </w:tcPr>
+          <w:p>
+            <w:pPr>
+              <w:spacing w:line="190" w:lineRule="exact"/>
+            </w:pPr>
+            <w:r>
+              <w:rPr>
+                <w:color w:val="6E6E6E"/>
+                <w:spacing w:val="14"/>
+                <w:sz w:val="12"/>
+                <w:szCs w:val="12"/>
+              </w:rPr>
+              <w:t>CNPJ</w:t>
+            </w:r>
+          </w:p>
+          <w:p>
+            <w:pPr>
+              <w:spacing w:line="200" w:lineRule="exact"/>
+            </w:pPr>
+            <w:r>
+              <w:rPr>
+                <w:b/>
+                <w:bCs/>
+                <w:color w:val="000000"/>
+                <w:sz w:val="16"/>
+                <w:szCs w:val="16"/>
+              </w:rPr>
+              <w:t>24.636.780/0001-2</w:t>
+            </w:r>
+            <w:r>
+              <w:rPr>
+                <w:b/>
+                <w:bCs/>
+                <w:color w:val="000000"/>
+                <w:sz w:val="16"/>
+                <w:szCs w:val="16"/>
+              </w:rPr>
+              <w:t>9</w:t>
+            </w:r>
+          </w:p>
+        </w:tc>
+        <w:tc>
+          <w:tcPr>
+            <w:tcW w:w="2693" w:type="dxa"/>
+            <w:tcBorders>
+              <w:bottom w:val="single" w:sz="2" w:space="0" w:color="CFCFCF"/>
+            </w:tcBorders>
+            <w:tcMar>
+              <w:top w:w="60" w:type="dxa"/>
+              <w:bottom w:w="60" w:type="dxa"/>
+            </w:tcMar>
+            <w:vAlign w:val="center"/>
+          </w:tcPr>
+          <w:p>
+            <w:pPr>
+              <w:spacing w:line="190" w:lineRule="exact"/>
+            </w:pPr>
+            <w:r>
+              <w:rPr>
+                <w:color w:val="6E6E6E"/>
+                <w:spacing w:val="14"/>
+                <w:sz w:val="12"/>
+                <w:szCs w:val="12"/>
+              </w:rPr>
+              <w:t>TELEFONE</w:t>
+            </w:r>
+          </w:p>
+          <w:p>
+            <w:pPr>
+              <w:spacing w:line="200" w:lineRule="exact"/>
+            </w:pPr>
+            <w:r>
+              <w:rPr>
+                <w:b/>
+                <w:bCs/>
+                <w:color w:val="000000"/>
+                <w:sz w:val="16"/>
+                <w:szCs w:val="16"/>
+              </w:rPr>
+              <w:t>(27) 99636-1212</w:t>
+            </w:r>
+          </w:p>
+        </w:tc>
+      </w:tr>
+      <w:tr>
+        <w:tc>
+          <w:tcPr>
+            <w:tcW w:w="5386" w:type="dxa"/>
+            <w:tcBorders>
+              <w:bottom w:val="single" w:sz="2" w:space="0" w:color="CFCFCF"/>
+            </w:tcBorders>
+            <w:tcMar>
+              <w:top w:w="60" w:type="dxa"/>
+              <w:bottom w:w="60" w:type="dxa"/>
+            </w:tcMar>
+            <w:vAlign w:val="center"/>
+          </w:tcPr>
+          <w:p>
+            <w:pPr>
+              <w:spacing w:line="190" w:lineRule="exact"/>
+              <w:rPr>
+                <w:lang w:val="pt-BR"/>
+              </w:rPr>
+            </w:pPr>
+            <w:r>
+              <w:rPr>
+                <w:color w:val="6E6E6E"/>
+                <w:spacing w:val="14"/>
+                <w:sz w:val="12"/>
+                <w:szCs w:val="12"/>
+                <w:lang w:val="pt-BR"/>
+              </w:rPr>
+              <w:t>ENDEREÇO</w:t>
+            </w:r>
+          </w:p>
+          <w:p>
+            <w:pPr>
+              <w:spacing w:line="200" w:lineRule="exact"/>
+              <w:rPr>
+                <w:lang w:val="pt-BR"/>
+              </w:rPr>
+            </w:pPr>
+            <w:r>
+              <w:rPr>
+                <w:b/>
+                <w:bCs/>
+                <w:color w:val="000000"/>
+                <w:sz w:val="16"/>
+                <w:szCs w:val="16"/>
+                <w:lang w:val="pt-BR"/>
+              </w:rPr>
+              <w:t>Rua Santo Antônio, 248 — Muquiçaba</w:t>
+            </w:r>
+          </w:p>
+        </w:tc>
+        <w:tc>
+          <w:tcPr>
+            <w:tcW w:w="2693" w:type="dxa"/>
+            <w:tcBorders>
+              <w:bottom w:val="single" w:sz="2" w:space="0" w:color="CFCFCF"/>
+            </w:tcBorders>
+            <w:tcMar>
+              <w:top w:w="60" w:type="dxa"/>
+              <w:bottom w:w="60" w:type="dxa"/>
+            </w:tcMar>
+            <w:vAlign w:val="center"/>
+          </w:tcPr>
+          <w:p>
+            <w:pPr>
+              <w:spacing w:line="190" w:lineRule="exact"/>
+            </w:pPr>
+            <w:r>
+              <w:rPr>
+                <w:color w:val="6E6E6E"/>
+                <w:spacing w:val="14"/>
+                <w:sz w:val="12"/>
+                <w:szCs w:val="12"/>
+              </w:rPr>
+              <w:t>CIDADE / UF</w:t>
+            </w:r>
+          </w:p>
+          <w:p>
+            <w:pPr>
+              <w:spacing w:line="200" w:lineRule="exact"/>
+            </w:pPr>
+            <w:r>
+              <w:rPr>
+                <w:b/>
+                <w:bCs/>
+                <w:color w:val="000000"/>
+                <w:sz w:val="16"/>
+                <w:szCs w:val="16"/>
+              </w:rPr>
+              <w:t>Guarapari / ES</w:t>
+            </w:r>
+          </w:p>
+        </w:tc>
+        <w:tc>
+          <w:tcPr>
+            <w:tcW w:w="2693" w:type="dxa"/>
+            <w:tcBorders>
+              <w:bottom w:val="single" w:sz="2" w:space="0" w:color="CFCFCF"/>
+            </w:tcBorders>
+            <w:tcMar>
+              <w:top w:w="60" w:type="dxa"/>
+              <w:bottom w:w="60" w:type="dxa"/>
+            </w:tcMar>
+            <w:vAlign w:val="center"/>
+          </w:tcPr>
+          <w:p>
+            <w:pPr>
+              <w:spacing w:line="190" w:lineRule="exact"/>
+            </w:pPr>
+            <w:r>
+              <w:rPr>
+                <w:color w:val="6E6E6E"/>
+                <w:spacing w:val="14"/>
+                <w:sz w:val="12"/>
+                <w:szCs w:val="12"/>
+              </w:rPr>
+              <w:t>CEP</w:t>
+            </w:r>
+          </w:p>
+          <w:p>
+            <w:pPr>
+              <w:spacing w:line="200" w:lineRule="exact"/>
+            </w:pPr>
+            <w:r>
+              <w:rPr>
+                <w:b/>
+                <w:bCs/>
+                <w:color w:val="000000"/>
+                <w:sz w:val="16"/>
+                <w:szCs w:val="16"/>
+              </w:rPr>
+              <w:t>29.215-030</w:t>
+            </w:r>
+          </w:p>
+        </w:tc>
+      </w:tr>
+    </w:tbl>
+    <w:p>
+      <w:pPr>
+        <w:spacing w:after="60"/>
+      </w:pPr>
+    </w:p>
+    <w:tbl>
+      <w:tblPr>
+        <w:tblW w:w="10772" w:type="dxa"/>
+        <w:tblLayout w:type="fixed"/>
+        <w:tblCellMar>
+          <w:top w:w="50" w:type="dxa"/>
+          <w:left w:w="110" w:type="dxa"/>
+          <w:bottom w:w="50" w:type="dxa"/>
+          <w:right w:w="110" w:type="dxa"/>
+        </w:tblCellMar>
+        <w:tblLook w:val="04A0" w:firstRow="1" w:lastRow="0" w:firstColumn="1" w:lastColumn="0" w:noHBand="0" w:noVBand="1"/>
+      </w:tblPr>
+      <w:tblGrid>
+        <w:gridCol w:w="2694"/>
+        <w:gridCol w:w="2693"/>
+        <w:gridCol w:w="2693"/>
+        <w:gridCol w:w="2692"/>
+      </w:tblGrid>
+      <w:tr>
+        <w:tc>
+          <w:tcPr>
+            <w:tcW w:w="10771" w:type="dxa"/>
+            <w:gridSpan w:val="4"/>
+            <w:shd w:val="clear" w:color="auto" w:fill="000000"/>
+          </w:tcPr>
+          <w:p>
+            <w:r>
+              <w:rPr>
+                <w:b/>
+                <w:bCs/>
+                <w:color w:val="FFFFFF"/>
+                <w:spacing w:val="26"/>
+              </w:rPr>
+              <w:t>2. DADOS DO COMPRADOR</w:t>
+            </w:r>
+          </w:p>
+        </w:tc>
+      </w:tr>
+      <w:tr>
+        <w:tc>
+          <w:tcPr>
+            <w:tcW w:w="5386" w:type="dxa"/>
+            <w:gridSpan w:val="2"/>
+            <w:tcBorders>
+              <w:bottom w:val="single" w:sz="2" w:space="0" w:color="CFCFCF"/>
+            </w:tcBorders>
+            <w:tcMar>
+              <w:top w:w="60" w:type="dxa"/>
+              <w:bottom w:w="60" w:type="dxa"/>
+            </w:tcMar>
+            <w:vAlign w:val="center"/>
+          </w:tcPr>
+          <w:p>
+            <w:pPr>
+              <w:spacing w:line="190" w:lineRule="exact"/>
+              <w:rPr>
+                <w:lang w:val="pt-BR"/>
+              </w:rPr>
+            </w:pPr>
+            <w:r>
+              <w:rPr>
+                <w:color w:val="6E6E6E"/>
+                <w:spacing w:val="14"/>
+                <w:sz w:val="12"/>
+                <w:szCs w:val="12"/>
+                <w:lang w:val="pt-BR"/>
+              </w:rPr>
+              <w:t>NOME COMPLETO</w:t>
+            </w:r>
+          </w:p>
+          <w:p>
+            <w:pPr>
+              <w:spacing w:line="200" w:lineRule="exact"/>
+              <w:rPr>
+                <w:lang w:val="pt-BR"/>
+              </w:rPr>
+            </w:pPr>
+            <w:r>
+              <w:rPr>
+                <w:b/>
+                <w:bCs/>
+                <w:color w:val="000000"/>
+                <w:sz w:val="16"/>
+                <w:szCs w:val="16"/>
+                <w:lang w:val="pt-BR"/>
+              </w:rPr>
+              <w:t>{NOME_COMPRADOR}</w:t>
+            </w:r>
+          </w:p>
+        </w:tc>
+        <w:tc>
+          <w:tcPr>
+            <w:tcW w:w="2693" w:type="dxa"/>
+            <w:tcBorders>
+              <w:bottom w:val="single" w:sz="2" w:space="0" w:color="CFCFCF"/>
+            </w:tcBorders>
+            <w:tcMar>
+              <w:top w:w="60" w:type="dxa"/>
+              <w:bottom w:w="60" w:type="dxa"/>
+            </w:tcMar>
+            <w:vAlign w:val="center"/>
+          </w:tcPr>
+          <w:p>
+            <w:pPr>
+              <w:spacing w:line="190" w:lineRule="exact"/>
+            </w:pPr>
+            <w:r>
+              <w:rPr>
+                <w:color w:val="6E6E6E"/>
+                <w:spacing w:val="14"/>
+                <w:sz w:val="12"/>
+                <w:szCs w:val="12"/>
+              </w:rPr>
+              <w:t>CPF</w:t>
+            </w:r>
+          </w:p>
+          <w:p>
+            <w:pPr>
+              <w:spacing w:line="200" w:lineRule="exact"/>
+            </w:pPr>
+            <w:r>
+              <w:rPr>
+                <w:b/>
+                <w:bCs/>
+                <w:color w:val="000000"/>
+                <w:sz w:val="16"/>
+                <w:szCs w:val="16"/>
+              </w:rPr>
+              <w:t>{CPF_COMPRADOR}</w:t>
+            </w:r>
+          </w:p>
+        </w:tc>
+        <w:tc>
+          <w:tcPr>
+            <w:tcW w:w="2692" w:type="dxa"/>
+            <w:tcBorders>
+              <w:bottom w:val="single" w:sz="2" w:space="0" w:color="CFCFCF"/>
+            </w:tcBorders>
+            <w:tcMar>
+              <w:top w:w="60" w:type="dxa"/>
+              <w:bottom w:w="60" w:type="dxa"/>
+            </w:tcMar>
+            <w:vAlign w:val="center"/>
+          </w:tcPr>
+          <w:p>
+            <w:pPr>
+              <w:spacing w:line="190" w:lineRule="exact"/>
+            </w:pPr>
+            <w:r>
+              <w:rPr>
+                <w:color w:val="6E6E6E"/>
+                <w:spacing w:val="14"/>
+                <w:sz w:val="12"/>
+                <w:szCs w:val="12"/>
+              </w:rPr>
+              <w:t>RG / INSCRIÇÃO</w:t>
+            </w:r>
+          </w:p>
+          <w:p>
+            <w:pPr>
+              <w:spacing w:line="200" w:lineRule="exact"/>
+            </w:pPr>
+            <w:r>
+              <w:rPr>
+                <w:b/>
+                <w:bCs/>
+                <w:color w:val="000000"/>
+                <w:sz w:val="16"/>
+                <w:szCs w:val="16"/>
+              </w:rPr>
+              <w:t>{RG_COMPRADOR}</w:t>
+            </w:r>
+          </w:p>
+        </w:tc>
+      </w:tr>
+      <w:tr>
+        <w:tc>
+          <w:tcPr>
+            <w:tcW w:w="2693" w:type="dxa"/>
+            <w:tcBorders>
+              <w:bottom w:val="single" w:sz="2" w:space="0" w:color="CFCFCF"/>
+            </w:tcBorders>
+            <w:tcMar>
+              <w:top w:w="60" w:type="dxa"/>
+              <w:bottom w:w="60" w:type="dxa"/>
+            </w:tcMar>
+            <w:vAlign w:val="center"/>
+          </w:tcPr>
+          <w:p>
+            <w:pPr>
+              <w:spacing w:line="190" w:lineRule="exact"/>
+            </w:pPr>
+            <w:r>
+              <w:rPr>
+                <w:color w:val="6E6E6E"/>
+                <w:spacing w:val="14"/>
+                <w:sz w:val="12"/>
+                <w:szCs w:val="12"/>
+              </w:rPr>
+              <w:t>ESTADO CIVIL</w:t>
+            </w:r>
+          </w:p>
+          <w:p>
+            <w:pPr>
+              <w:spacing w:line="200" w:lineRule="exact"/>
+            </w:pPr>
+            <w:r>
+              <w:rPr>
+                <w:b/>
+                <w:bCs/>
+                <w:color w:val="000000"/>
+                <w:sz w:val="16"/>
+                <w:szCs w:val="16"/>
+              </w:rPr>
+              <w:t>{ESTADO_CIVIL}</w:t>
+            </w:r>
+          </w:p>
+        </w:tc>
+        <w:tc>
+          <w:tcPr>
+            <w:tcW w:w="2693" w:type="dxa"/>
+            <w:tcBorders>
+              <w:bottom w:val="single" w:sz="2" w:space="0" w:color="CFCFCF"/>
+            </w:tcBorders>
+            <w:tcMar>
+              <w:top w:w="60" w:type="dxa"/>
+              <w:bottom w:w="60" w:type="dxa"/>
+            </w:tcMar>
+            <w:vAlign w:val="center"/>
+          </w:tcPr>
+          <w:p>
+            <w:pPr>
+              <w:spacing w:line="190" w:lineRule="exact"/>
+            </w:pPr>
+            <w:r>
+              <w:rPr>
+                <w:color w:val="6E6E6E"/>
+                <w:spacing w:val="14"/>
+                <w:sz w:val="12"/>
+                <w:szCs w:val="12"/>
+              </w:rPr>
+              <w:t>TELEFONE</w:t>
+            </w:r>
+          </w:p>
+          <w:p>
+            <w:pPr>
+              <w:spacing w:line="200" w:lineRule="exact"/>
+            </w:pPr>
+            <w:r>
+              <w:rPr>
+                <w:b/>
+                <w:bCs/>
+                <w:color w:val="000000"/>
+                <w:sz w:val="16"/>
+                <w:szCs w:val="16"/>
+              </w:rPr>
+              <w:t>{TELEFONE_COMPRADOR}</w:t>
+            </w:r>
+          </w:p>
+        </w:tc>
+        <w:tc>
+          <w:tcPr>
+            <w:tcW w:w="2693" w:type="dxa"/>
+            <w:tcBorders>
+              <w:bottom w:val="single" w:sz="2" w:space="0" w:color="CFCFCF"/>
+            </w:tcBorders>
+            <w:tcMar>
+              <w:top w:w="60" w:type="dxa"/>
+              <w:bottom w:w="60" w:type="dxa"/>
+            </w:tcMar>
+            <w:vAlign w:val="center"/>
+          </w:tcPr>
+          <w:p>
+            <w:pPr>
+              <w:spacing w:line="190" w:lineRule="exact"/>
+            </w:pPr>
+            <w:r>
+              <w:rPr>
+                <w:color w:val="6E6E6E"/>
+                <w:spacing w:val="14"/>
+                <w:sz w:val="12"/>
+                <w:szCs w:val="12"/>
+              </w:rPr>
+              <w:t>CIDADE / UF</w:t>
+            </w:r>
+          </w:p>
+          <w:p>
+            <w:pPr>
+              <w:spacing w:line="200" w:lineRule="exact"/>
+            </w:pPr>
+            <w:r>
+              <w:rPr>
+                <w:b/>
+                <w:bCs/>
+                <w:color w:val="000000"/>
+                <w:sz w:val="16"/>
+                <w:szCs w:val="16"/>
+              </w:rPr>
+              <w:t>Guarapari / ES</w:t>
+            </w:r>
+          </w:p>
+        </w:tc>
+        <w:tc>
+          <w:tcPr>
+            <w:tcW w:w="2692" w:type="dxa"/>
+            <w:tcBorders>
+              <w:bottom w:val="single" w:sz="2" w:space="0" w:color="CFCFCF"/>
+            </w:tcBorders>
+            <w:tcMar>
+              <w:top w:w="60" w:type="dxa"/>
+              <w:bottom w:w="60" w:type="dxa"/>
+            </w:tcMar>
+            <w:vAlign w:val="center"/>
+          </w:tcPr>
+          <w:p>
+            <w:pPr>
+              <w:spacing w:line="190" w:lineRule="exact"/>
+            </w:pPr>
+            <w:r>
+              <w:rPr>
+                <w:color w:val="6E6E6E"/>
+                <w:spacing w:val="14"/>
+                <w:sz w:val="12"/>
+                <w:szCs w:val="12"/>
+              </w:rPr>
+              <w:t>CEP</w:t>
+            </w:r>
+          </w:p>
+          <w:p>
+            <w:pPr>
+              <w:spacing w:line="200" w:lineRule="exact"/>
+            </w:pPr>
+            <w:r>
+              <w:rPr>
+                <w:b/>
+                <w:bCs/>
+                <w:color w:val="000000"/>
+                <w:sz w:val="16"/>
+                <w:szCs w:val="16"/>
+              </w:rPr>
+              <w:t>{CEP_COMPRADOR}</w:t>
+            </w:r>
+          </w:p>
+        </w:tc>
+      </w:tr>
+      <w:tr>
+        <w:tc>
+          <w:tcPr>
+            <w:tcW w:w="10771" w:type="dxa"/>
+            <w:gridSpan w:val="4"/>
+            <w:tcBorders>
+              <w:bottom w:val="single" w:sz="2" w:space="0" w:color="CFCFCF"/>
+            </w:tcBorders>
+            <w:tcMar>
+              <w:top w:w="60" w:type="dxa"/>
+              <w:bottom w:w="60" w:type="dxa"/>
+            </w:tcMar>
+            <w:vAlign w:val="center"/>
+          </w:tcPr>
+          <w:p>
+            <w:pPr>
+              <w:spacing w:line="190" w:lineRule="exact"/>
+            </w:pPr>
+            <w:r>
+              <w:rPr>
+                <w:color w:val="6E6E6E"/>
+                <w:spacing w:val="14"/>
+                <w:sz w:val="12"/>
+                <w:szCs w:val="12"/>
+              </w:rPr>
+              <w:t>ENDEREÇO</w:t>
+            </w:r>
+          </w:p>
+          <w:p>
+            <w:pPr>
+              <w:spacing w:line="200" w:lineRule="exact"/>
+            </w:pPr>
+            <w:r>
+              <w:rPr>
+                <w:b/>
+                <w:bCs/>
+                <w:color w:val="000000"/>
+                <w:sz w:val="16"/>
+                <w:szCs w:val="16"/>
+              </w:rPr>
+              <w:t>Rua Manaus, 10 — Camurugi</w:t>
+            </w:r>
+          </w:p>
+        </w:tc>
+      </w:tr>
+    </w:tbl>
+    <w:p>
+      <w:pPr>
+        <w:spacing w:after="60"/>
+      </w:pPr>
+    </w:p>
+    <w:tbl>
+      <w:tblPr>
+        <w:tblW w:w="10772" w:type="dxa"/>
+        <w:tblLayout w:type="fixed"/>
+        <w:tblCellMar>
+          <w:top w:w="50" w:type="dxa"/>
+          <w:left w:w="110" w:type="dxa"/>
+          <w:bottom w:w="50" w:type="dxa"/>
+          <w:right w:w="110" w:type="dxa"/>
+        </w:tblCellMar>
+        <w:tblLook w:val="04A0" w:firstRow="1" w:lastRow="0" w:firstColumn="1" w:lastColumn="0" w:noHBand="0" w:noVBand="1"/>
+      </w:tblPr>
+      <w:tblGrid>
+        <w:gridCol w:w="2694"/>
+        <w:gridCol w:w="2693"/>
+        <w:gridCol w:w="2693"/>
+        <w:gridCol w:w="2692"/>
+      </w:tblGrid>
+      <w:tr>
+        <w:tc>
+          <w:tcPr>
+            <w:tcW w:w="10771" w:type="dxa"/>
+            <w:gridSpan w:val="4"/>
+            <w:shd w:val="clear" w:color="auto" w:fill="000000"/>
+          </w:tcPr>
+          <w:p>
+            <w:r>
+              <w:rPr>
+                <w:b/>
+                <w:bCs/>
+                <w:color w:val="FFFFFF"/>
+                <w:spacing w:val="26"/>
+              </w:rPr>
+              <w:t>3. IDENTIFICAÇÃO DO VEÍCULO</w:t>
+            </w:r>
+          </w:p>
+        </w:tc>
+      </w:tr>
+      <w:tr>
+        <w:tc>
+          <w:tcPr>
+            <w:tcW w:w="2693" w:type="dxa"/>
+            <w:tcBorders>
+              <w:bottom w:val="single" w:sz="2" w:space="0" w:color="CFCFCF"/>
+            </w:tcBorders>
+            <w:tcMar>
+              <w:top w:w="60" w:type="dxa"/>
+              <w:bottom w:w="60" w:type="dxa"/>
+            </w:tcMar>
+            <w:vAlign w:val="center"/>
+          </w:tcPr>
+          <w:p>
+            <w:pPr>
+              <w:spacing w:line="190" w:lineRule="exact"/>
+            </w:pPr>
+            <w:r>
+              <w:rPr>
+                <w:color w:val="6E6E6E"/>
+                <w:spacing w:val="14"/>
+                <w:sz w:val="12"/>
+                <w:szCs w:val="12"/>
+              </w:rPr>
+              <w:t>MARCA</w:t>
+            </w:r>
+          </w:p>
+          <w:p>
+            <w:pPr>
+              <w:spacing w:line="200" w:lineRule="exact"/>
+            </w:pPr>
+            <w:r>
+              <w:rPr>
+                <w:b/>
+                <w:bCs/>
+                <w:color w:val="000000"/>
+                <w:sz w:val="16"/>
+                <w:szCs w:val="16"/>
+              </w:rPr>
+              <w:t>{MARCA}</w:t>
+            </w:r>
+          </w:p>
+        </w:tc>
+        <w:tc>
+          <w:tcPr>
+            <w:tcW w:w="2693" w:type="dxa"/>
+            <w:tcBorders>
+              <w:bottom w:val="single" w:sz="2" w:space="0" w:color="CFCFCF"/>
+            </w:tcBorders>
+            <w:tcMar>
+              <w:top w:w="60" w:type="dxa"/>
+              <w:bottom w:w="60" w:type="dxa"/>
+            </w:tcMar>
+            <w:vAlign w:val="center"/>
+          </w:tcPr>
+          <w:p>
+            <w:pPr>
+              <w:spacing w:line="190" w:lineRule="exact"/>
+            </w:pPr>
+            <w:r>
+              <w:rPr>
+                <w:color w:val="6E6E6E"/>
+                <w:spacing w:val="14"/>
+                <w:sz w:val="12"/>
+                <w:szCs w:val="12"/>
+              </w:rPr>
+              <w:t>MODELO</w:t>
+            </w:r>
+          </w:p>
+          <w:p>
+            <w:pPr>
+              <w:spacing w:line="200" w:lineRule="exact"/>
+            </w:pPr>
+            <w:r>
+              <w:rPr>
+                <w:b/>
+                <w:bCs/>
+                <w:color w:val="000000"/>
+                <w:sz w:val="16"/>
+                <w:szCs w:val="16"/>
+              </w:rPr>
+              <w:t>{MODELO}</w:t>
+            </w:r>
+          </w:p>
+        </w:tc>
+        <w:tc>
+          <w:tcPr>
+            <w:tcW w:w="2693" w:type="dxa"/>
+            <w:tcBorders>
+              <w:bottom w:val="single" w:sz="2" w:space="0" w:color="CFCFCF"/>
+            </w:tcBorders>
+            <w:tcMar>
+              <w:top w:w="60" w:type="dxa"/>
+              <w:bottom w:w="60" w:type="dxa"/>
+            </w:tcMar>
+            <w:vAlign w:val="center"/>
+          </w:tcPr>
+          <w:p>
+            <w:pPr>
+              <w:spacing w:line="190" w:lineRule="exact"/>
+            </w:pPr>
+            <w:r>
+              <w:rPr>
+                <w:color w:val="6E6E6E"/>
+                <w:spacing w:val="14"/>
+                <w:sz w:val="12"/>
+                <w:szCs w:val="12"/>
+              </w:rPr>
+              <w:t>ANO / MODELO</w:t>
+            </w:r>
+          </w:p>
+          <w:p>
+            <w:pPr>
+              <w:spacing w:line="200" w:lineRule="exact"/>
+            </w:pPr>
+            <w:r>
+              <w:rPr>
+                <w:b/>
+                <w:bCs/>
+                <w:color w:val="000000"/>
+                <w:sz w:val="16"/>
+                <w:szCs w:val="16"/>
+              </w:rPr>
+              <w:t>{ANO_FAB_MOD}</w:t>
+            </w:r>
+          </w:p>
+        </w:tc>
+        <w:tc>
+          <w:tcPr>
+            <w:tcW w:w="2692" w:type="dxa"/>
+            <w:tcBorders>
+              <w:bottom w:val="single" w:sz="2" w:space="0" w:color="CFCFCF"/>
+            </w:tcBorders>
+            <w:tcMar>
+              <w:top w:w="60" w:type="dxa"/>
+              <w:bottom w:w="60" w:type="dxa"/>
+            </w:tcMar>
+            <w:vAlign w:val="center"/>
+          </w:tcPr>
+          <w:p>
+            <w:pPr>
+              <w:spacing w:line="190" w:lineRule="exact"/>
+            </w:pPr>
+            <w:r>
+              <w:rPr>
+                <w:color w:val="6E6E6E"/>
+                <w:spacing w:val="14"/>
+                <w:sz w:val="12"/>
+                <w:szCs w:val="12"/>
+              </w:rPr>
+              <w:t>COMBUSTÍVEL</w:t>
+            </w:r>
+          </w:p>
+          <w:p>
+            <w:pPr>
+              <w:spacing w:line="200" w:lineRule="exact"/>
+            </w:pPr>
+            <w:r>
+              <w:rPr>
+                <w:b/>
+                <w:bCs/>
+                <w:color w:val="000000"/>
+                <w:sz w:val="16"/>
+                <w:szCs w:val="16"/>
+              </w:rPr>
+              <w:t>{COMBUSTIVEL}</w:t>
+            </w:r>
+          </w:p>
+        </w:tc>
+      </w:tr>
+      <w:tr>
+        <w:tc>
+          <w:tcPr>
+            <w:tcW w:w="2693" w:type="dxa"/>
+            <w:tcBorders>
+              <w:bottom w:val="single" w:sz="2" w:space="0" w:color="CFCFCF"/>
+            </w:tcBorders>
+            <w:tcMar>
+              <w:top w:w="60" w:type="dxa"/>
+              <w:bottom w:w="60" w:type="dxa"/>
+            </w:tcMar>
+            <w:vAlign w:val="center"/>
+          </w:tcPr>
+          <w:p>
+            <w:pPr>
+              <w:spacing w:line="190" w:lineRule="exact"/>
+            </w:pPr>
+            <w:r>
+              <w:rPr>
+                <w:color w:val="6E6E6E"/>
+                <w:spacing w:val="14"/>
+                <w:sz w:val="12"/>
+                <w:szCs w:val="12"/>
+              </w:rPr>
+              <w:t>COR</w:t>
+            </w:r>
+          </w:p>
+          <w:p>
+            <w:pPr>
+              <w:spacing w:line="200" w:lineRule="exact"/>
+            </w:pPr>
+            <w:r>
+              <w:rPr>
+                <w:b/>
+                <w:bCs/>
+                <w:color w:val="000000"/>
+                <w:sz w:val="16"/>
+                <w:szCs w:val="16"/>
+              </w:rPr>
+              <w:t>{COR}</w:t>
+            </w:r>
+          </w:p>
+        </w:tc>
+        <w:tc>
+          <w:tcPr>
+            <w:tcW w:w="2693" w:type="dxa"/>
+            <w:tcBorders>
+              <w:bottom w:val="single" w:sz="2" w:space="0" w:color="CFCFCF"/>
+            </w:tcBorders>
+            <w:tcMar>
+              <w:top w:w="60" w:type="dxa"/>
+              <w:bottom w:w="60" w:type="dxa"/>
+            </w:tcMar>
+            <w:vAlign w:val="center"/>
+          </w:tcPr>
+          <w:p>
+            <w:pPr>
+              <w:spacing w:line="190" w:lineRule="exact"/>
+            </w:pPr>
+            <w:r>
+              <w:rPr>
+                <w:color w:val="6E6E6E"/>
+                <w:spacing w:val="14"/>
+                <w:sz w:val="12"/>
+                <w:szCs w:val="12"/>
+              </w:rPr>
+              <w:t>QUILOMETRAGEM</w:t>
+            </w:r>
+          </w:p>
+          <w:p>
+            <w:pPr>
+              <w:spacing w:line="200" w:lineRule="exact"/>
+            </w:pPr>
+            <w:r>
+              <w:rPr>
+                <w:b/>
+                <w:bCs/>
+                <w:color w:val="000000"/>
+                <w:sz w:val="16"/>
+                <w:szCs w:val="16"/>
+              </w:rPr>
+              <w:t>{QUILOMETRAGEM}</w:t>
+            </w:r>
+          </w:p>
+        </w:tc>
+        <w:tc>
+          <w:tcPr>
+            <w:tcW w:w="2693" w:type="dxa"/>
+            <w:tcBorders>
+              <w:bottom w:val="single" w:sz="2" w:space="0" w:color="CFCFCF"/>
+            </w:tcBorders>
+            <w:tcMar>
+              <w:top w:w="60" w:type="dxa"/>
+              <w:bottom w:w="60" w:type="dxa"/>
+            </w:tcMar>
+            <w:vAlign w:val="center"/>
+          </w:tcPr>
+          <w:p>
+            <w:pPr>
+              <w:spacing w:line="190" w:lineRule="exact"/>
+            </w:pPr>
+            <w:r>
+              <w:rPr>
+                <w:color w:val="6E6E6E"/>
+                <w:spacing w:val="14"/>
+                <w:sz w:val="12"/>
+                <w:szCs w:val="12"/>
+              </w:rPr>
+              <w:t>PLACA</w:t>
+            </w:r>
+          </w:p>
+          <w:p>
+            <w:pPr>
+              <w:spacing w:line="200" w:lineRule="exact"/>
+            </w:pPr>
+            <w:r>
+              <w:rPr>
+                <w:b/>
+                <w:bCs/>
+                <w:color w:val="000000"/>
+                <w:sz w:val="16"/>
+                <w:szCs w:val="16"/>
+              </w:rPr>
+              <w:t>{PLACA}</w:t>
+            </w:r>
+          </w:p>
+        </w:tc>
+        <w:tc>
+          <w:tcPr>
+            <w:tcW w:w="2692" w:type="dxa"/>
+            <w:tcBorders>
+              <w:bottom w:val="single" w:sz="2" w:space="0" w:color="CFCFCF"/>
+            </w:tcBorders>
+            <w:tcMar>
+              <w:top w:w="60" w:type="dxa"/>
+              <w:bottom w:w="60" w:type="dxa"/>
+            </w:tcMar>
+            <w:vAlign w:val="center"/>
+          </w:tcPr>
+          <w:p>
+            <w:pPr>
+              <w:spacing w:line="190" w:lineRule="exact"/>
+            </w:pPr>
+            <w:r>
+              <w:rPr>
+                <w:color w:val="6E6E6E"/>
+                <w:spacing w:val="14"/>
+                <w:sz w:val="12"/>
+                <w:szCs w:val="12"/>
+              </w:rPr>
+              <w:t>RENAVAM</w:t>
+            </w:r>
+          </w:p>
+          <w:p>
+            <w:pPr>
+              <w:spacing w:line="200" w:lineRule="exact"/>
+            </w:pPr>
+            <w:r>
+              <w:rPr>
+                <w:b/>
+                <w:bCs/>
+                <w:color w:val="000000"/>
+                <w:sz w:val="16"/>
+                <w:szCs w:val="16"/>
+              </w:rPr>
+              <w:t>{RENAVAM}</w:t>
+            </w:r>
+          </w:p>
+        </w:tc>
+      </w:tr>
+      <w:tr>
+        <w:tc>
+          <w:tcPr>
+            <w:tcW w:w="5386" w:type="dxa"/>
+            <w:gridSpan w:val="2"/>
+            <w:tcBorders>
+              <w:bottom w:val="single" w:sz="2" w:space="0" w:color="CFCFCF"/>
+            </w:tcBorders>
+            <w:tcMar>
+              <w:top w:w="60" w:type="dxa"/>
+              <w:bottom w:w="60" w:type="dxa"/>
+            </w:tcMar>
+            <w:vAlign w:val="center"/>
+          </w:tcPr>
+          <w:p>
+            <w:pPr>
+              <w:spacing w:line="190" w:lineRule="exact"/>
+            </w:pPr>
+            <w:r>
+              <w:rPr>
+                <w:color w:val="6E6E6E"/>
+                <w:spacing w:val="14"/>
+                <w:sz w:val="12"/>
+                <w:szCs w:val="12"/>
+              </w:rPr>
+              <w:t>CHASSI</w:t>
+            </w:r>
+          </w:p>
+          <w:p>
+            <w:pPr>
+              <w:spacing w:line="200" w:lineRule="exact"/>
+            </w:pPr>
+            <w:r>
+              <w:rPr>
+                <w:b/>
+                <w:bCs/>
+                <w:color w:val="000000"/>
+                <w:sz w:val="16"/>
+                <w:szCs w:val="16"/>
+              </w:rPr>
+              <w:t>{CHASSI}</w:t>
+            </w:r>
+          </w:p>
+        </w:tc>
+        <w:tc>
+          <w:tcPr>
+            <w:tcW w:w="5385" w:type="dxa"/>
+            <w:gridSpan w:val="2"/>
+            <w:tcBorders>
+              <w:bottom w:val="single" w:sz="2" w:space="0" w:color="CFCFCF"/>
+            </w:tcBorders>
+            <w:tcMar>
+              <w:top w:w="60" w:type="dxa"/>
+              <w:bottom w:w="60" w:type="dxa"/>
+            </w:tcMar>
+            <w:vAlign w:val="center"/>
+          </w:tcPr>
+          <w:p>
+            <w:pPr>
+              <w:spacing w:line="190" w:lineRule="exact"/>
+            </w:pPr>
+            <w:r>
+              <w:rPr>
+                <w:color w:val="6E6E6E"/>
+                <w:spacing w:val="14"/>
+                <w:sz w:val="12"/>
+                <w:szCs w:val="12"/>
+              </w:rPr>
+              <w:t>TIPO</w:t>
+            </w:r>
+          </w:p>
+          <w:p>
+            <w:pPr>
+              <w:spacing w:line="200" w:lineRule="exact"/>
+            </w:pPr>
+            <w:r>
+              <w:rPr>
+                <w:b/>
+                <w:bCs/>
+                <w:color w:val="000000"/>
+                <w:sz w:val="16"/>
+                <w:szCs w:val="16"/>
+              </w:rPr>
+              <w:t>{TIPO_VEICULO}</w:t>
+            </w:r>
+          </w:p>
+        </w:tc>
+      </w:tr>
+    </w:tbl>
+    <w:p>
+      <w:pPr>
+        <w:spacing w:after="60"/>
+      </w:pPr>
+    </w:p>
+    <w:tbl>
+      <w:tblPr>
+        <w:tblW w:w="10772" w:type="dxa"/>
+        <w:tblLayout w:type="fixed"/>
+        <w:tblCellMar>
+          <w:top w:w="50" w:type="dxa"/>
+          <w:left w:w="110" w:type="dxa"/>
+          <w:bottom w:w="50" w:type="dxa"/>
+          <w:right w:w="110" w:type="dxa"/>
+        </w:tblCellMar>
+        <w:tblLook w:val="04A0" w:firstRow="1" w:lastRow="0" w:firstColumn="1" w:lastColumn="0" w:noHBand="0" w:noVBand="1"/>
+      </w:tblPr>
+      <w:tblGrid>
+        <w:gridCol w:w="10772"/>
+      </w:tblGrid>
+      <w:tr>
+        <w:tc>
+          <w:tcPr>
+            <w:tcW w:w="10772" w:type="dxa"/>
+            <w:shd w:val="clear" w:color="auto" w:fill="000000"/>
+          </w:tcPr>
+          <w:p>
+            <w:pPr>
+              <w:rPr>
+                <w:lang w:val="pt-BR"/>
+              </w:rPr>
+            </w:pPr>
+            <w:r>
+              <w:rPr>
+                <w:b/>
+                <w:bCs/>
+                <w:color w:val="FFFFFF"/>
+                <w:spacing w:val="26"/>
+                <w:lang w:val="pt-BR"/>
+              </w:rPr>
+              <w:t>4. VALOR E CONDIÇÕES DE PAGAMENTO</w:t>
+            </w:r>
+          </w:p>
+        </w:tc>
+      </w:tr>
+      <w:tr>
+        <w:tc>
+          <w:tcPr>
+            <w:tcW w:w="10772" w:type="dxa"/>
+            <w:shd w:val="clear" w:color="auto" w:fill="F0F0F0"/>
+            <w:tcMar>
+              <w:top w:w="90" w:type="dxa"/>
+              <w:left w:w="130" w:type="dxa"/>
+              <w:bottom w:w="90" w:type="dxa"/>
+              <w:right w:w="130" w:type="dxa"/>
+            </w:tcMar>
+          </w:tcPr>
+          <w:p>
+            <w:pPr>
+              <w:spacing w:line="220" w:lineRule="exact"/>
+              <w:rPr>
+                <w:lang w:val="pt-BR"/>
+              </w:rPr>
+            </w:pPr>
+            <w:r>
+              <w:rPr>
+                <w:color w:val="6E6E6E"/>
+                <w:spacing w:val="30"/>
+                <w:sz w:val="13"/>
+                <w:szCs w:val="13"/>
+                <w:lang w:val="pt-BR"/>
+              </w:rPr>
+              <w:t xml:space="preserve">VALOR TOTAL DA VENDA    </w:t>
+            </w:r>
+            <w:r>
+              <w:rPr>
+                <w:b/>
+                <w:bCs/>
+                <w:color w:val="000000"/>
+                <w:sz w:val="24"/>
+                <w:szCs w:val="24"/>
+                <w:lang w:val="pt-BR"/>
+              </w:rPr>
+              <w:t>R$ {VALOR_NUMERICO}</w:t>
+            </w:r>
+            <w:r>
+              <w:rPr>
+                <w:color w:val="6E6E6E"/>
+                <w:sz w:val="14"/>
+                <w:szCs w:val="14"/>
+                <w:lang w:val="pt-BR"/>
+              </w:rPr>
+              <w:t xml:space="preserve">   {VALOR_EXTENSO}</w:t>
+            </w:r>
+          </w:p>
+        </w:tc>
+      </w:tr>
+      <w:tr>
+        <w:tc>
+          <w:tcPr>
+            <w:tcW w:w="10772" w:type="dxa"/>
+            <w:tcBorders>
+              <w:bottom w:val="single" w:sz="2" w:space="0" w:color="CFCFCF"/>
+            </w:tcBorders>
+            <w:tcMar>
+              <w:top w:w="90" w:type="dxa"/>
+              <w:left w:w="130" w:type="dxa"/>
+              <w:bottom w:w="90" w:type="dxa"/>
+              <w:right w:w="130" w:type="dxa"/>
+            </w:tcMar>
+          </w:tcPr>
+          <w:p>
+            <w:pPr>
+              <w:spacing w:after="20" w:line="200" w:lineRule="exact"/>
+              <w:jc w:val="both"/>
+              <w:rPr>
+                <w:lang w:val="pt-BR"/>
+              </w:rPr>
+            </w:pPr>
+            {@CONDICOES_XML}
+          </w:p>
+        </w:tc>
+      </w:tr>
+    </w:tbl>
+    <w:p>
+      <w:pPr>
+        <w:spacing w:after="60"/>
+        <w:rPr>
+          <w:lang w:val="pt-BR"/>
+        </w:rPr>
+      </w:pPr>
+    </w:p>
+    <w:tbl>
+      <w:tblPr>
+        <w:tblW w:w="10772" w:type="dxa"/>
+        <w:tblLayout w:type="fixed"/>
+        <w:tblCellMar>
+          <w:top w:w="50" w:type="dxa"/>
+          <w:left w:w="110" w:type="dxa"/>
+          <w:bottom w:w="50" w:type="dxa"/>
+          <w:right w:w="110" w:type="dxa"/>
+        </w:tblCellMar>
+        <w:tblLook w:val="04A0" w:firstRow="1" w:lastRow="0" w:firstColumn="1" w:lastColumn="0" w:noHBand="0" w:noVBand="1"/>
+      </w:tblPr>
+      <w:tblGrid>
+        <w:gridCol w:w="10772"/>
+      </w:tblGrid>
+      <w:tr>
+        <w:tc>
+          <w:tcPr>
+            <w:tcW w:w="10772" w:type="dxa"/>
+            <w:shd w:val="clear" w:color="auto" w:fill="000000"/>
+          </w:tcPr>
+          <w:p>
+            <w:r>
+              <w:rPr>
+                <w:b/>
+                <w:bCs/>
+                <w:color w:val="FFFFFF"/>
+                <w:spacing w:val="26"/>
+              </w:rPr>
+              <w:t>5. CLÁUSULAS CONTRATUAIS</w:t>
+            </w:r>
+          </w:p>
+        </w:tc>
+      </w:tr>
+    </w:tbl>
+    <w:p>
+      <w:pPr>
+        <w:spacing w:before="70" w:line="200" w:lineRule="exact"/>
+        <w:jc w:val="both"/>
+        <w:rPr>
+          <w:lang w:val="pt-BR"/>
+        </w:rPr>
+      </w:pPr>
+      <w:r>
+        <w:rPr>
+          <w:lang w:val="pt-BR"/>
+        </w:rPr>
+        <w:t>Pelo presente instrumento particular de contrato de compra e venda de veículo, firmado pelas partes acima qualificadas, aqui denominadas simplesmente VENDEDOR e COMPRADOR, é justo e contratado o seguinte:</w:t>
+      </w:r>
+    </w:p>
+    <w:p>
+      <w:pPr>
+        <w:spacing w:before="26" w:line="200" w:lineRule="exact"/>
+        <w:jc w:val="both"/>
+        <w:rPr>
+          <w:lang w:val="pt-BR"/>
+        </w:rPr>
+      </w:pPr>
+      <w:r>
+        <w:rPr>
+          <w:b/>
+          <w:bCs/>
+          <w:color w:val="000000"/>
+          <w:lang w:val="pt-BR"/>
+        </w:rPr>
+        <w:t xml:space="preserve">Cláusula 1ª — Objeto. </w:t>
+      </w:r>
+      <w:r>
+        <w:rPr>
+          <w:lang w:val="pt-BR"/>
+        </w:rPr>
+        <w:t>O VENDEDOR vende e transfere ao COMPRADOR a propriedade do bem objeto do presente instrumento, pelo preço certo e ajustado entre as partes, acima indicado.</w:t>
+      </w:r>
+    </w:p>
+    <w:p>
+      <w:pPr>
+        <w:spacing w:before="26" w:line="200" w:lineRule="exact"/>
+        <w:ind w:left="220"/>
+        <w:jc w:val="both"/>
+        <w:rPr>
+          <w:lang w:val="pt-BR"/>
+        </w:rPr>
+      </w:pPr>
+      <w:r>
+        <w:rPr>
+          <w:b/>
+          <w:bCs/>
+          <w:color w:val="000000"/>
+          <w:lang w:val="pt-BR"/>
+        </w:rPr>
+        <w:t xml:space="preserve">Parágrafo Primeiro. </w:t>
+      </w:r>
+      <w:r>
+        <w:rPr>
+          <w:lang w:val="pt-BR"/>
+        </w:rPr>
+        <w:t>O COMPRADOR declara neste ato que examinou criteriosamente o veículo acima indicado em todos os seus itens e componentes, verificando o motor, a lataria e o estado geral do mesmo, razão pela qual o adquire no estado em que se apresenta.</w:t>
+      </w:r>
+    </w:p>
+    <w:p>
+      <w:pPr>
+        <w:spacing w:before="26" w:line="200" w:lineRule="exact"/>
+        <w:jc w:val="both"/>
+        <w:rPr>
+          <w:lang w:val="pt-BR"/>
+        </w:rPr>
+      </w:pPr>
+      <w:r>
+        <w:rPr>
+          <w:b/>
+          <w:bCs/>
+          <w:color w:val="000000"/>
+          <w:lang w:val="pt-BR"/>
+        </w:rPr>
+        <w:t xml:space="preserve">Cláusula 2ª — Responsabilidade a partir da assinatura. </w:t>
+      </w:r>
+      <w:r>
+        <w:rPr>
+          <w:lang w:val="pt-BR"/>
+        </w:rPr>
+        <w:t>O VENDEDOR estará isento de responder administrativa, civil ou penalmente por qualquer evento ocorrido a partir da data da assinatura do presente contrato, sendo que responde por todos aqueles anteriores.</w:t>
+      </w:r>
+    </w:p>
+    <w:p>
+      <w:pPr>
+        <w:spacing w:before="26" w:line="200" w:lineRule="exact"/>
+        <w:jc w:val="both"/>
+        <w:rPr>
+          <w:lang w:val="pt-BR"/>
+        </w:rPr>
+      </w:pPr>
+      <w:r>
+        <w:rPr>
+          <w:b/>
+          <w:bCs/>
+          <w:color w:val="000000"/>
+          <w:lang w:val="pt-BR"/>
+        </w:rPr>
+        <w:t xml:space="preserve">Cláusula 3ª — Entrega livre de ônus. </w:t>
+      </w:r>
+      <w:r>
+        <w:rPr>
+          <w:lang w:val="pt-BR"/>
+        </w:rPr>
+        <w:t>O VENDEDOR se obriga a entregar o referido bem livre de qualquer ônus, principalmente os que se referem aos débitos de multas, IPVA, licenciamento e seguro obrigatório, devidos até a data da venda, inclusive no que diz respeito às multas que ainda não tenham sido cadastradas ou notificadas.</w:t>
+      </w:r>
+    </w:p>
+    <w:p>
+      <w:pPr>
+        <w:spacing w:before="26" w:line="200" w:lineRule="exact"/>
+        <w:jc w:val="both"/>
+        <w:rPr>
+          <w:lang w:val="pt-BR"/>
+        </w:rPr>
+      </w:pPr>
+      <w:r>
+        <w:rPr>
+          <w:b/>
+          <w:bCs/>
+          <w:color w:val="000000"/>
+          <w:lang w:val="pt-BR"/>
+        </w:rPr>
+        <w:t xml:space="preserve">Cláusula 4ª — Despesas de transferência e financiamento. </w:t>
+      </w:r>
+      <w:r>
+        <w:rPr>
+          <w:lang w:val="pt-BR"/>
+        </w:rPr>
+        <w:t>As despesas com a transferência da propriedade e com o financiamento são de responsabilidade exclusiva do COMPRADOR.</w:t>
+      </w:r>
+    </w:p>
+    <w:p>
+      <w:pPr>
+        <w:spacing w:before="26" w:line="200" w:lineRule="exact"/>
+        <w:jc w:val="both"/>
+        <w:rPr>
+          <w:lang w:val="pt-BR"/>
+        </w:rPr>
+      </w:pPr>
+      <w:r>
+        <w:rPr>
+          <w:b/>
+          <w:bCs/>
+          <w:color w:val="000000"/>
+          <w:lang w:val="pt-BR"/>
+        </w:rPr>
+        <w:t xml:space="preserve">Cláusula 5ª — Informações prestadas ao comprador. </w:t>
+      </w:r>
+      <w:r>
+        <w:rPr>
+          <w:lang w:val="pt-BR"/>
+        </w:rPr>
+        <w:t>O COMPRADOR foi previamente informado pelo VENDEDOR no que diz respeito ao valor dos tributos incidentes sobre a comercialização do veículo e à regularidade do veículo quanto a furto, multas e taxas anuais legalmente devidas, débitos de impostos, alienação fiduciária e quaisquer outros registros que limitem ou impeçam a circulação do veículo.</w:t>
+      </w:r>
+    </w:p>
+    <w:p>
+      <w:pPr>
+        <w:spacing w:before="26" w:line="200" w:lineRule="exact"/>
+        <w:jc w:val="both"/>
+        <w:rPr>
+          <w:lang w:val="pt-BR"/>
+        </w:rPr>
+      </w:pPr>
+      <w:r>
+        <w:rPr>
+          <w:b/>
+          <w:bCs/>
+          <w:color w:val="000000"/>
+          <w:lang w:val="pt-BR"/>
+        </w:rPr>
+        <w:t xml:space="preserve">Cláusula 6ª — Foro. </w:t>
+      </w:r>
+      <w:r>
+        <w:rPr>
+          <w:lang w:val="pt-BR"/>
+        </w:rPr>
+        <w:t>Fica eleito o foro da Comarca de Guarapari, Estado do Espírito Santo, para dirimir quaisquer dúvidas ou litígios decorrentes deste contrato, com renúncia expressa de qualquer outro, por mais privilegiado que seja.</w:t>
+      </w:r>
+    </w:p>
+    <w:p>
+      <w:pPr>
+        <w:spacing w:before="26" w:line="200" w:lineRule="exact"/>
+        <w:jc w:val="both"/>
+        <w:rPr>
+          <w:lang w:val="pt-BR"/>
+        </w:rPr>
+      </w:pPr>
+      <w:r>
+        <w:rPr>
+          <w:b/>
+          <w:bCs/>
+          <w:color w:val="000000"/>
+          <w:lang w:val="pt-BR"/>
+        </w:rPr>
+        <w:t xml:space="preserve">Cláusula 7ª — Garantia. </w:t>
+      </w:r>
+      <w:r>
+        <w:rPr>
+          <w:lang w:val="pt-BR"/>
+        </w:rPr>
+        <w:t>A garantia do veículo será feita conforme o Código de Defesa do Consumidor.</w:t>
+      </w:r>
+    </w:p>
+    <w:p>
+      <w:pPr>
+        <w:spacing w:before="26" w:line="200" w:lineRule="exact"/>
+        <w:jc w:val="both"/>
+        <w:rPr>
+          <w:lang w:val="pt-BR"/>
+        </w:rPr>
+      </w:pPr>
+      <w:r>
+        <w:rPr>
+          <w:b/>
+          <w:bCs/>
+          <w:color w:val="000000"/>
+          <w:lang w:val="pt-BR"/>
+        </w:rPr>
+        <w:t xml:space="preserve">Cláusula 8ª — Seguros vinculados ao financiamento. </w:t>
+      </w:r>
+      <w:r>
+        <w:rPr>
+          <w:lang w:val="pt-BR"/>
+        </w:rPr>
+        <w:t>O contrato de financiamento deste veículo possui os seguintes seguros inclusos: {SEGUROS_LISTA}, no valor total de R$ {SEGUROS_VALOR}.</w:t>
+      </w:r>
+    </w:p>
+    <w:p>
+      <w:pPr>
+        <w:spacing w:before="26" w:line="200" w:lineRule="exact"/>
+        <w:ind w:left="220"/>
+        <w:jc w:val="both"/>
+        <w:rPr>
+          <w:lang w:val="pt-BR"/>
+        </w:rPr>
+      </w:pPr>
+      <w:r>
+        <w:rPr>
+          <w:b/>
+          <w:bCs/>
+          <w:color w:val="000000"/>
+          <w:lang w:val="pt-BR"/>
+        </w:rPr>
+        <w:t xml:space="preserve">Parágrafo Único. </w:t>
+      </w:r>
+      <w:r>
+        <w:rPr>
+          <w:lang w:val="pt-BR"/>
+        </w:rPr>
+        <w:t>[   ] do financiamento por parte do COMPRADOR, o mesmo se responsabiliza em quitar todas as despesas referentes ao processo de retirada do gravame.</w:t>
+      </w:r>
+    </w:p>
+    <w:p>
+      <w:pPr>
+        <w:spacing w:before="26" w:line="200" w:lineRule="exact"/>
+        <w:jc w:val="both"/>
+        <w:rPr>
+          <w:lang w:val="pt-BR"/>
+        </w:rPr>
+      </w:pPr>
+      <w:r>
+        <w:rPr>
+          <w:b/>
+          <w:bCs/>
+          <w:color w:val="000000"/>
+          <w:lang w:val="pt-BR"/>
+        </w:rPr>
+        <w:t xml:space="preserve">Cláusula 9ª — Disposições finais. </w:t>
+      </w:r>
+      <w:r>
+        <w:rPr>
+          <w:lang w:val="pt-BR"/>
+        </w:rPr>
+        <w:t>O veículo não possui chave reserva. A garantia só terá efeito quando o veículo for analisado por mecânicos desta empresa, perdendo-se a garantia em caso de qualquer serviço realizado por terceiros.</w:t>
+      </w:r>
+    </w:p>
+    <w:p>
+      <w:pPr>
+        <w:spacing w:before="80" w:line="200" w:lineRule="exact"/>
+        <w:jc w:val="both"/>
+        <w:rPr>
+          <w:lang w:val="pt-BR"/>
+        </w:rPr>
+      </w:pPr>
+      <w:r>
+        <w:rPr>
+          <w:lang w:val="pt-BR"/>
+        </w:rPr>
+        <w:t>E por estarem assim acordados, firmam o presente instrumento em 02 (duas) vias de igual teor e forma, obrigando-se as partes por si, seus herdeiros e sucessores, elegendo o foro desta cidade para dirimir quaisquer dúvidas ou pendências.</w:t>
+      </w:r>
+    </w:p>
+    <w:p>
+      <w:pPr>
+        <w:spacing w:before="90" w:line="200" w:lineRule="exact"/>
+        <w:jc w:val="right"/>
+        <w:rPr>
+          <w:lang w:val="pt-BR"/>
+        </w:rPr>
+      </w:pPr>
+      <w:r>
+        <w:rPr>
+          <w:b/>
+          <w:bCs/>
+          <w:color w:val="000000"/>
+          <w:lang w:val="pt-BR"/>
+        </w:rPr>
+        <w:t>Guarapari / ES, {DATA_CONTRATO_EXTENSO}.</w:t>
+      </w:r>
+    </w:p>
+    <w:tbl>
+      <w:tblPr>
+        <w:tblW w:w="10772" w:type="dxa"/>
+        <w:tblLayout w:type="fixed"/>
+        <w:tblCellMar>
+          <w:left w:w="420" w:type="dxa"/>
+          <w:right w:w="420" w:type="dxa"/>
+        </w:tblCellMar>
+        <w:tblLook w:val="04A0" w:firstRow="1" w:lastRow="0" w:firstColumn="1" w:lastColumn="0" w:noHBand="0" w:noVBand="1"/>
+      </w:tblPr>
+      <w:tblGrid>
+        <w:gridCol w:w="5387"/>
+        <w:gridCol w:w="5385"/>
+      </w:tblGrid>
+      <w:tr>
+        <w:tc>
+          <w:tcPr>
+            <w:tcW w:w="5386" w:type="dxa"/>
+          </w:tcPr>
+          <w:p>
+            <w:pPr>
+              <w:pBdr>
+                <w:top w:val="single" w:sz="6" w:space="0" w:color="000000"/>
+              </w:pBdr>
+              <w:spacing w:before="400" w:after="40"/>
+              <w:rPr>
+                <w:lang w:val="pt-BR"/>
+              </w:rPr>
+            </w:pPr>
+          </w:p>
+          <w:p>
+            <w:pPr>
+              <w:spacing w:line="200" w:lineRule="exact"/>
+              <w:jc w:val="center"/>
+              <w:rPr>
+                <w:lang w:val="pt-BR"/>
+              </w:rPr>
+            </w:pPr>
+            <w:r>
+              <w:rPr>
+                <w:b/>
+                <w:bCs/>
+                <w:color w:val="000000"/>
+                <w:sz w:val="14"/>
+                <w:szCs w:val="14"/>
+                <w:lang w:val="pt-BR"/>
+              </w:rPr>
+              <w:t>R C P VEÍCULOS EIRELI</w:t>
+            </w:r>
+          </w:p>
+          <w:p>
+            <w:pPr>
+              <w:spacing w:line="200" w:lineRule="exact"/>
+              <w:jc w:val="center"/>
+              <w:rPr>
+                <w:lang w:val="pt-BR"/>
+              </w:rPr>
+            </w:pPr>
+            <w:r>
+              <w:rPr>
+                <w:color w:val="6E6E6E"/>
+                <w:spacing w:val="14"/>
+                <w:sz w:val="12"/>
+                <w:szCs w:val="12"/>
+                <w:lang w:val="pt-BR"/>
+              </w:rPr>
+              <w:t>VENDEDOR</w:t>
+            </w:r>
+          </w:p>
+        </w:tc>
+        <w:tc>
+          <w:tcPr>
+            <w:tcW w:w="5385" w:type="dxa"/>
+          </w:tcPr>
+          <w:p>
+            <w:pPr>
+              <w:pBdr>
+                <w:top w:val="single" w:sz="6" w:space="0" w:color="000000"/>
+              </w:pBdr>
+              <w:spacing w:before="400" w:after="40"/>
+              <w:rPr>
+                <w:lang w:val="pt-BR"/>
+              </w:rPr>
+            </w:pPr>
+          </w:p>
+          <w:p>
+            <w:pPr>
+              <w:spacing w:line="200" w:lineRule="exact"/>
+              <w:jc w:val="center"/>
+              <w:rPr>
+                <w:lang w:val="pt-BR"/>
+              </w:rPr>
+            </w:pPr>
+            <w:r>
+              <w:rPr>
+                <w:b/>
+                <w:bCs/>
+                <w:color w:val="000000"/>
+                <w:sz w:val="14"/>
+                <w:szCs w:val="14"/>
+                <w:lang w:val="pt-BR"/>
+              </w:rPr>
+              <w:t>{NOME_COMPRADOR}</w:t>
+            </w:r>
+          </w:p>
+          <w:p>
+            <w:pPr>
+              <w:spacing w:line="200" w:lineRule="exact"/>
+              <w:jc w:val="center"/>
+              <w:rPr>
+                <w:lang w:val="pt-BR"/>
+              </w:rPr>
+            </w:pPr>
+            <w:r>
+              <w:rPr>
+                <w:color w:val="6E6E6E"/>
+                <w:spacing w:val="14"/>
+                <w:sz w:val="12"/>
+                <w:szCs w:val="12"/>
+                <w:lang w:val="pt-BR"/>
+              </w:rPr>
+              <w:t>COMPRADOR</w:t>
+            </w:r>
+          </w:p>
+        </w:tc>
+      </w:tr>
+    </w:tbl>
+    <w:p>
+      <w:pPr>
+        <w:rPr>
+          <w:lang w:val="pt-BR"/>
+        </w:rPr>
+      </w:pPr>
+    </w:p>
+    <w:sectPr>
+      <w:pgSz w:w="11906" w:h="16838"/>
+      <w:pgMar w:top="420" w:right="567" w:bottom="340" w:left="567" w:header="0" w:footer="0" w:gutter="0"/>
+      <w:cols w:space="720"/>
+      <w:formProt w:val="0"/>
+      <w:docGrid w:linePitch="360" w:charSpace="18431"/>
+    </w:sectPr>
+  </w:body>
+</w:document>
 </file>
 
 <file path=word/styles.xml><?xml version="1.0" encoding="utf-8"?>

</xml_diff>

<commit_message>
fix: adicionar opcao VALOR PAGO A VISTA nas condicoes de pagamento e corrigir exibicao de condicoes no contrato docx com a tag {CONDICOES_TEXT}
</commit_message>
<xml_diff>
--- a/frontend/public/modelo_contrato_dricar.docx
+++ b/frontend/public/modelo_contrato_dricar.docx
@@ -1429,7 +1429,21 @@
                 <w:lang w:val="pt-BR"/>
               </w:rPr>
             </w:pPr>
-            {@CONDICOES_XML}
+            <w:r>
+              <w:rPr>
+                <w:b/>
+                <w:bCs/>
+                <w:color w:val="000000"/>
+                <w:lang w:val="pt-BR"/>
+              </w:rPr>
+              <w:t xml:space="preserve">Condições: </w:t>
+            </w:r>
+            <w:r>
+              <w:rPr>
+                <w:lang w:val="pt-BR"/>
+              </w:rPr>
+              <w:t xml:space="preserve">{CONDICOES_TEXT}</w:t>
+            </w:r>
           </w:p>
         </w:tc>
       </w:tr>

</xml_diff>

<commit_message>
feat(erp): melhora formulario de venda, telefones, tipo de veiculo, negrito no contrato e clausula de seguro condicional
</commit_message>
<xml_diff>
--- a/frontend/public/modelo_contrato_dricar.docx
+++ b/frontend/public/modelo_contrato_dricar.docx
@@ -745,7 +745,7 @@
                 <w:sz w:val="16"/>
                 <w:szCs w:val="16"/>
               </w:rPr>
-              <w:t>Guarapari / ES</w:t>
+              <w:t>{CIDADE_UF_COMPRADOR}</w:t>
             </w:r>
           </w:p>
         </w:tc>
@@ -1438,12 +1438,24 @@
               </w:rPr>
               <w:t xml:space="preserve">Condições: </w:t>
             </w:r>
-            <w:r>
-              <w:rPr>
-                <w:lang w:val="pt-BR"/>
-              </w:rPr>
-              <w:t xml:space="preserve">{CONDICOES_TEXT}</w:t>
-            </w:r>
+            {#CONDICOES_LISTA}
+            <w:r>
+              <w:rPr>
+                <w:b/>
+                <w:bCs/>
+                <w:color w:val="000000"/>
+                <w:lang w:val="pt-BR"/>
+              </w:rPr>
+              <w:t xml:space="preserve">{label} </w:t>
+            </w:r>
+            <w:r>
+              <w:rPr>
+                <w:color w:val="000000"/>
+                <w:lang w:val="pt-BR"/>
+              </w:rPr>
+              <w:t xml:space="preserve">{text}{sep} </w:t>
+            </w:r>
+            {/CONDICOES_LISTA}
           </w:p>
         </w:tc>
       </w:tr>
@@ -1700,6 +1712,11 @@
       </w:r>
     </w:p>
     <w:p>
+      <w:r>
+        <w:t>{#HAS_SEGURO}</w:t>
+      </w:r>
+    </w:p>
+    <w:p>
       <w:pPr>
         <w:spacing w:before="26" w:line="200" w:lineRule="exact"/>
         <w:jc w:val="both"/>
@@ -1749,6 +1766,11 @@
       </w:r>
     </w:p>
     <w:p>
+      <w:r>
+        <w:t>{/HAS_SEGURO}</w:t>
+      </w:r>
+    </w:p>
+    <w:p>
       <w:pPr>
         <w:spacing w:before="26" w:line="200" w:lineRule="exact"/>
         <w:jc w:val="both"/>
@@ -1763,7 +1785,7 @@
           <w:color w:val="000000"/>
           <w:lang w:val="pt-BR"/>
         </w:rPr>
-        <w:t xml:space="preserve">Cláusula 9ª — Disposições finais. </w:t>
+        <w:t xml:space="preserve">{CLAUSULA_DISPOSICOES_NUM} — Disposições finais. </w:t>
       </w:r>
       <w:r>
         <w:rPr>

</xml_diff>

<commit_message>
fix: docx template address, bold conditions and currency formatting
</commit_message>
<xml_diff>
--- a/frontend/public/modelo_contrato_dricar.docx
+++ b/frontend/public/modelo_contrato_dricar.docx
@@ -832,7 +832,7 @@
                 <w:sz w:val="16"/>
                 <w:szCs w:val="16"/>
               </w:rPr>
-              <w:t>Rua Manaus, 10 — Camurugi</w:t>
+              <w:t>{ENDERECO_COMPRADOR}</w:t>
             </w:r>
           </w:p>
         </w:tc>
@@ -1438,7 +1438,9 @@
               </w:rPr>
               <w:t xml:space="preserve">Condições: </w:t>
             </w:r>
-            {#CONDICOES_LISTA}
+            <w:r>
+              <w:t>{#CONDICOES_LISTA}</w:t>
+            </w:r>
             <w:r>
               <w:rPr>
                 <w:b/>
@@ -1455,7 +1457,9 @@
               </w:rPr>
               <w:t xml:space="preserve">{text}{sep} </w:t>
             </w:r>
-            {/CONDICOES_LISTA}
+            <w:r>
+              <w:t>{/CONDICOES_LISTA}</w:t>
+            </w:r>
           </w:p>
         </w:tc>
       </w:tr>

</xml_diff>